<commit_message>
Updated README, project report
</commit_message>
<xml_diff>
--- a/reports/Smart_Traffic_Demand_Prediction_Project_Report.docx
+++ b/reports/Smart_Traffic_Demand_Prediction_Project_Report.docx
@@ -51,23 +51,288 @@
           <w:sz w:val="28"/>
           <w:szCs w:val="28"/>
         </w:rPr>
-        <w:t>Submitted by: Kondreddy Vikhila</w:t>
-      </w:r>
-    </w:p>
-    <w:p>
-      <w:pPr>
-        <w:rPr>
-          <w:sz w:val="28"/>
-          <w:szCs w:val="28"/>
-        </w:rPr>
-      </w:pPr>
-      <w:r>
-        <w:rPr>
-          <w:sz w:val="28"/>
-          <w:szCs w:val="28"/>
-        </w:rPr>
-        <w:br w:type="page"/>
-      </w:r>
+        <w:t xml:space="preserve">Submitted by: </w:t>
+      </w:r>
+      <w:proofErr w:type="spellStart"/>
+      <w:r>
+        <w:rPr>
+          <w:sz w:val="28"/>
+          <w:szCs w:val="28"/>
+        </w:rPr>
+        <w:t>Kondreddy</w:t>
+      </w:r>
+      <w:proofErr w:type="spellEnd"/>
+      <w:r>
+        <w:rPr>
+          <w:sz w:val="28"/>
+          <w:szCs w:val="28"/>
+        </w:rPr>
+        <w:t xml:space="preserve"> Vikhila</w:t>
+      </w:r>
+    </w:p>
+    <w:p>
+      <w:pPr>
+        <w:jc w:val="center"/>
+        <w:rPr>
+          <w:sz w:val="28"/>
+          <w:szCs w:val="28"/>
+        </w:rPr>
+      </w:pPr>
+    </w:p>
+    <w:p>
+      <w:pPr>
+        <w:jc w:val="center"/>
+        <w:rPr>
+          <w:sz w:val="28"/>
+          <w:szCs w:val="28"/>
+        </w:rPr>
+      </w:pPr>
+      <w:r>
+        <w:rPr>
+          <w:noProof/>
+          <w:sz w:val="28"/>
+          <w:szCs w:val="28"/>
+        </w:rPr>
+        <w:drawing>
+          <wp:inline distT="0" distB="0" distL="0" distR="0" wp14:anchorId="1E7106AE" wp14:editId="19467ED5">
+            <wp:extent cx="4175463" cy="3304309"/>
+            <wp:effectExtent l="0" t="0" r="0" b="0"/>
+            <wp:docPr id="360431044" name="Picture 1"/>
+            <wp:cNvGraphicFramePr>
+              <a:graphicFrameLocks xmlns:a="http://schemas.openxmlformats.org/drawingml/2006/main" noChangeAspect="1"/>
+            </wp:cNvGraphicFramePr>
+            <a:graphic xmlns:a="http://schemas.openxmlformats.org/drawingml/2006/main">
+              <a:graphicData uri="http://schemas.openxmlformats.org/drawingml/2006/picture">
+                <pic:pic xmlns:pic="http://schemas.openxmlformats.org/drawingml/2006/picture">
+                  <pic:nvPicPr>
+                    <pic:cNvPr id="360431044" name="Picture 360431044"/>
+                    <pic:cNvPicPr/>
+                  </pic:nvPicPr>
+                  <pic:blipFill>
+                    <a:blip r:embed="rId7">
+                      <a:extLst>
+                        <a:ext uri="{28A0092B-C50C-407E-A947-70E740481C1C}">
+                          <a14:useLocalDpi xmlns:a14="http://schemas.microsoft.com/office/drawing/2010/main" val="0"/>
+                        </a:ext>
+                      </a:extLst>
+                    </a:blip>
+                    <a:stretch>
+                      <a:fillRect/>
+                    </a:stretch>
+                  </pic:blipFill>
+                  <pic:spPr>
+                    <a:xfrm>
+                      <a:off x="0" y="0"/>
+                      <a:ext cx="4303137" cy="3405345"/>
+                    </a:xfrm>
+                    <a:prstGeom prst="rect">
+                      <a:avLst/>
+                    </a:prstGeom>
+                  </pic:spPr>
+                </pic:pic>
+              </a:graphicData>
+            </a:graphic>
+          </wp:inline>
+        </w:drawing>
+      </w:r>
+    </w:p>
+    <w:p>
+      <w:pPr>
+        <w:rPr>
+          <w:sz w:val="28"/>
+          <w:szCs w:val="28"/>
+        </w:rPr>
+      </w:pPr>
+    </w:p>
+    <w:p>
+      <w:pPr>
+        <w:rPr>
+          <w:sz w:val="28"/>
+          <w:szCs w:val="28"/>
+        </w:rPr>
+      </w:pPr>
+    </w:p>
+    <w:p>
+      <w:pPr>
+        <w:rPr>
+          <w:b/>
+          <w:bCs/>
+          <w:sz w:val="28"/>
+          <w:szCs w:val="28"/>
+        </w:rPr>
+      </w:pPr>
+      <w:r>
+        <w:rPr>
+          <w:rFonts w:ascii="Segoe UI Emoji" w:hAnsi="Segoe UI Emoji" w:cs="Segoe UI Emoji"/>
+          <w:b/>
+          <w:bCs/>
+          <w:sz w:val="28"/>
+          <w:szCs w:val="28"/>
+        </w:rPr>
+        <w:t>🎥</w:t>
+      </w:r>
+      <w:r>
+        <w:rPr>
+          <w:b/>
+          <w:bCs/>
+          <w:sz w:val="28"/>
+          <w:szCs w:val="28"/>
+        </w:rPr>
+        <w:t xml:space="preserve"> Demo Video</w:t>
+      </w:r>
+    </w:p>
+    <w:p>
+      <w:hyperlink r:id="rId8" w:history="1">
+        <w:r>
+          <w:rPr>
+            <w:rStyle w:val="Hyperlink"/>
+          </w:rPr>
+          <w:t>https://drive.google.com/file/d/13mKpZaiRv_Hov47p0WJsRUyRaaMF0VI2/view?usp=sharing</w:t>
+        </w:r>
+      </w:hyperlink>
+    </w:p>
+    <w:p>
+      <w:pPr>
+        <w:rPr>
+          <w:b/>
+          <w:bCs/>
+          <w:sz w:val="28"/>
+          <w:szCs w:val="28"/>
+        </w:rPr>
+      </w:pPr>
+      <w:r>
+        <w:rPr>
+          <w:rFonts w:ascii="Segoe UI Emoji" w:hAnsi="Segoe UI Emoji" w:cs="Segoe UI Emoji"/>
+          <w:b/>
+          <w:bCs/>
+          <w:sz w:val="28"/>
+          <w:szCs w:val="28"/>
+        </w:rPr>
+        <w:t>🌐</w:t>
+      </w:r>
+      <w:r>
+        <w:rPr>
+          <w:b/>
+          <w:bCs/>
+          <w:sz w:val="28"/>
+          <w:szCs w:val="28"/>
+        </w:rPr>
+        <w:t xml:space="preserve"> Live Application</w:t>
+      </w:r>
+    </w:p>
+    <w:p>
+      <w:hyperlink r:id="rId9" w:history="1">
+        <w:r>
+          <w:rPr>
+            <w:rStyle w:val="Hyperlink"/>
+          </w:rPr>
+          <w:t>https://traffic-demand-prediction-zdkhydh22oqxou2otqgo3j.streamlit.app/</w:t>
+        </w:r>
+      </w:hyperlink>
+    </w:p>
+    <w:p>
+      <w:pPr>
+        <w:rPr>
+          <w:b/>
+          <w:bCs/>
+          <w:sz w:val="28"/>
+          <w:szCs w:val="28"/>
+        </w:rPr>
+      </w:pPr>
+      <w:r>
+        <w:rPr>
+          <w:rFonts w:ascii="Segoe UI Emoji" w:hAnsi="Segoe UI Emoji" w:cs="Segoe UI Emoji"/>
+          <w:b/>
+          <w:bCs/>
+          <w:sz w:val="28"/>
+          <w:szCs w:val="28"/>
+        </w:rPr>
+        <w:t>💻</w:t>
+      </w:r>
+      <w:r>
+        <w:rPr>
+          <w:b/>
+          <w:bCs/>
+          <w:sz w:val="28"/>
+          <w:szCs w:val="28"/>
+        </w:rPr>
+        <w:t xml:space="preserve"> GitHub Repository</w:t>
+      </w:r>
+    </w:p>
+    <w:p>
+      <w:hyperlink r:id="rId10" w:history="1">
+        <w:r>
+          <w:rPr>
+            <w:rStyle w:val="Hyperlink"/>
+          </w:rPr>
+          <w:t>https://github.com/kondreddyvikhila/traffic-demand-prediction/tree/main</w:t>
+        </w:r>
+      </w:hyperlink>
+    </w:p>
+    <w:p/>
+    <w:p>
+      <w:pPr>
+        <w:rPr>
+          <w:sz w:val="28"/>
+          <w:szCs w:val="28"/>
+        </w:rPr>
+      </w:pPr>
+    </w:p>
+    <w:p>
+      <w:pPr>
+        <w:rPr>
+          <w:sz w:val="28"/>
+          <w:szCs w:val="28"/>
+        </w:rPr>
+      </w:pPr>
+    </w:p>
+    <w:p>
+      <w:pPr>
+        <w:rPr>
+          <w:sz w:val="28"/>
+          <w:szCs w:val="28"/>
+        </w:rPr>
+      </w:pPr>
+    </w:p>
+    <w:p>
+      <w:pPr>
+        <w:rPr>
+          <w:sz w:val="28"/>
+          <w:szCs w:val="28"/>
+        </w:rPr>
+      </w:pPr>
+    </w:p>
+    <w:p>
+      <w:pPr>
+        <w:rPr>
+          <w:sz w:val="28"/>
+          <w:szCs w:val="28"/>
+        </w:rPr>
+      </w:pPr>
+    </w:p>
+    <w:p>
+      <w:pPr>
+        <w:rPr>
+          <w:sz w:val="28"/>
+          <w:szCs w:val="28"/>
+        </w:rPr>
+      </w:pPr>
+    </w:p>
+    <w:p>
+      <w:pPr>
+        <w:rPr>
+          <w:sz w:val="28"/>
+          <w:szCs w:val="28"/>
+        </w:rPr>
+      </w:pPr>
+    </w:p>
+    <w:p>
+      <w:pPr>
+        <w:rPr>
+          <w:sz w:val="28"/>
+          <w:szCs w:val="28"/>
+        </w:rPr>
+      </w:pPr>
     </w:p>
     <w:p>
       <w:pPr>
@@ -85,7 +350,6 @@
           <w:sz w:val="32"/>
           <w:szCs w:val="32"/>
         </w:rPr>
-        <w:lastRenderedPageBreak/>
         <w:t>1.</w:t>
       </w:r>
       <w:r>
@@ -382,6 +646,7 @@
           <w:b/>
           <w:bCs/>
         </w:rPr>
+        <w:lastRenderedPageBreak/>
         <w:t>Total Records</w:t>
       </w:r>
       <w:r>
@@ -537,16 +802,7 @@
           <w:sz w:val="28"/>
           <w:szCs w:val="28"/>
         </w:rPr>
-        <w:t xml:space="preserve">The dataset contains historical traffic and weather information collected over </w:t>
-      </w:r>
-      <w:r>
-        <w:rPr>
-          <w:rFonts w:ascii="Times New Roman" w:hAnsi="Times New Roman" w:cs="Times New Roman"/>
-          <w:sz w:val="28"/>
-          <w:szCs w:val="28"/>
-        </w:rPr>
-        <w:lastRenderedPageBreak/>
-        <w:t>several years. It includes temporal, environmental, and traffic-related attribut</w:t>
+        <w:t>The dataset contains historical traffic and weather information collected over several years. It includes temporal, environmental, and traffic-related attribut</w:t>
       </w:r>
       <w:r>
         <w:rPr>
@@ -673,7 +929,7 @@
                     <pic:cNvPicPr/>
                   </pic:nvPicPr>
                   <pic:blipFill>
-                    <a:blip r:embed="rId7" cstate="print">
+                    <a:blip r:embed="rId11" cstate="print">
                       <a:extLst>
                         <a:ext uri="{28A0092B-C50C-407E-A947-70E740481C1C}">
                           <a14:useLocalDpi xmlns:a14="http://schemas.microsoft.com/office/drawing/2010/main" val="0"/>
@@ -805,7 +1061,26 @@
           <w:sz w:val="28"/>
           <w:szCs w:val="28"/>
         </w:rPr>
-        <w:t>Before training the machine learning models, the dataset was preprocessed to improve data quality and model performance. Data preprocessing is an essential step that prepares the raw dataset for effective machine learning by handling inconsistencies, transforming features, and selecting relevant information.</w:t>
+        <w:lastRenderedPageBreak/>
+        <w:t xml:space="preserve">Before training the machine learning models, the dataset was </w:t>
+      </w:r>
+      <w:proofErr w:type="spellStart"/>
+      <w:r>
+        <w:rPr>
+          <w:rFonts w:ascii="Times New Roman" w:hAnsi="Times New Roman" w:cs="Times New Roman"/>
+          <w:sz w:val="28"/>
+          <w:szCs w:val="28"/>
+        </w:rPr>
+        <w:t>preprocessed</w:t>
+      </w:r>
+      <w:proofErr w:type="spellEnd"/>
+      <w:r>
+        <w:rPr>
+          <w:rFonts w:ascii="Times New Roman" w:hAnsi="Times New Roman" w:cs="Times New Roman"/>
+          <w:sz w:val="28"/>
+          <w:szCs w:val="28"/>
+        </w:rPr>
+        <w:t xml:space="preserve"> to improve data quality and model performance. Data preprocessing is an essential step that prepares the raw dataset for effective machine learning by handling inconsistencies, transforming features, and selecting relevant information.</w:t>
       </w:r>
     </w:p>
     <w:p>
@@ -874,8 +1149,25 @@
           <w:sz w:val="28"/>
           <w:szCs w:val="28"/>
         </w:rPr>
-        <w:lastRenderedPageBreak/>
-        <w:t xml:space="preserve">Extracted Hour, Day, and Month from the date_time feature. </w:t>
+        <w:t xml:space="preserve">Extracted Hour, Day, and Month from the </w:t>
+      </w:r>
+      <w:proofErr w:type="spellStart"/>
+      <w:r>
+        <w:rPr>
+          <w:rFonts w:ascii="Times New Roman" w:hAnsi="Times New Roman" w:cs="Times New Roman"/>
+          <w:sz w:val="28"/>
+          <w:szCs w:val="28"/>
+        </w:rPr>
+        <w:t>date_time</w:t>
+      </w:r>
+      <w:proofErr w:type="spellEnd"/>
+      <w:r>
+        <w:rPr>
+          <w:rFonts w:ascii="Times New Roman" w:hAnsi="Times New Roman" w:cs="Times New Roman"/>
+          <w:sz w:val="28"/>
+          <w:szCs w:val="28"/>
+        </w:rPr>
+        <w:t xml:space="preserve"> feature. </w:t>
       </w:r>
     </w:p>
     <w:p>
@@ -921,7 +1213,25 @@
           <w:sz w:val="28"/>
           <w:szCs w:val="28"/>
         </w:rPr>
-        <w:t xml:space="preserve">Created the target variable Traffic_Level (Low, Medium, High). </w:t>
+        <w:t xml:space="preserve">Created the target variable </w:t>
+      </w:r>
+      <w:proofErr w:type="spellStart"/>
+      <w:r>
+        <w:rPr>
+          <w:rFonts w:ascii="Times New Roman" w:hAnsi="Times New Roman" w:cs="Times New Roman"/>
+          <w:sz w:val="28"/>
+          <w:szCs w:val="28"/>
+        </w:rPr>
+        <w:t>Traffic_Level</w:t>
+      </w:r>
+      <w:proofErr w:type="spellEnd"/>
+      <w:r>
+        <w:rPr>
+          <w:rFonts w:ascii="Times New Roman" w:hAnsi="Times New Roman" w:cs="Times New Roman"/>
+          <w:sz w:val="28"/>
+          <w:szCs w:val="28"/>
+        </w:rPr>
+        <w:t xml:space="preserve"> (Low, Medium, High). </w:t>
       </w:r>
     </w:p>
     <w:p>
@@ -1025,6 +1335,7 @@
           <w:sz w:val="28"/>
           <w:szCs w:val="28"/>
         </w:rPr>
+        <w:lastRenderedPageBreak/>
         <w:drawing>
           <wp:inline distT="0" distB="0" distL="0" distR="0" wp14:anchorId="16BF7F1C" wp14:editId="4D8AB537">
             <wp:extent cx="6314508" cy="4212000"/>
@@ -1043,7 +1354,7 @@
                     </pic:cNvPicPr>
                   </pic:nvPicPr>
                   <pic:blipFill>
-                    <a:blip r:embed="rId8">
+                    <a:blip r:embed="rId12">
                       <a:extLst>
                         <a:ext uri="{28A0092B-C50C-407E-A947-70E740481C1C}">
                           <a14:useLocalDpi xmlns:a14="http://schemas.microsoft.com/office/drawing/2010/main" val="0"/>
@@ -1224,7 +1535,25 @@
           <w:sz w:val="28"/>
           <w:szCs w:val="28"/>
         </w:rPr>
-        <w:t>Exploratory Data Analysis (EDA) was performed to understand the characteristics of the traffic dataset before developing the machine learning models. Different visualizations were used to analyze traffic patterns, weather conditions, road types, temporal trends, and relationships among features. The insights obtained from EDA helped in selecting relevant features for traffic volume prediction.</w:t>
+        <w:t xml:space="preserve">Exploratory Data Analysis (EDA) was performed to understand the characteristics of the traffic dataset before developing the machine learning models. Different visualizations were used to </w:t>
+      </w:r>
+      <w:proofErr w:type="spellStart"/>
+      <w:r>
+        <w:rPr>
+          <w:rFonts w:ascii="Times New Roman" w:hAnsi="Times New Roman" w:cs="Times New Roman"/>
+          <w:sz w:val="28"/>
+          <w:szCs w:val="28"/>
+        </w:rPr>
+        <w:t>analyze</w:t>
+      </w:r>
+      <w:proofErr w:type="spellEnd"/>
+      <w:r>
+        <w:rPr>
+          <w:rFonts w:ascii="Times New Roman" w:hAnsi="Times New Roman" w:cs="Times New Roman"/>
+          <w:sz w:val="28"/>
+          <w:szCs w:val="28"/>
+        </w:rPr>
+        <w:t xml:space="preserve"> traffic patterns, weather conditions, road types, temporal trends, and relationships among features. The insights obtained from EDA helped in selecting relevant features for traffic volume prediction.</w:t>
       </w:r>
     </w:p>
     <w:p>
@@ -1273,7 +1602,7 @@
                     <pic:cNvPicPr/>
                   </pic:nvPicPr>
                   <pic:blipFill>
-                    <a:blip r:embed="rId9">
+                    <a:blip r:embed="rId13">
                       <a:extLst>
                         <a:ext uri="{28A0092B-C50C-407E-A947-70E740481C1C}">
                           <a14:useLocalDpi xmlns:a14="http://schemas.microsoft.com/office/drawing/2010/main" val="0"/>
@@ -1299,7 +1628,6 @@
           </wp:inline>
         </w:drawing>
       </w:r>
-      <w:proofErr w:type="gramStart"/>
       <w:r>
         <w:rPr>
           <w:rFonts w:asciiTheme="majorHAnsi" w:hAnsiTheme="majorHAnsi" w:cs="Times New Roman"/>
@@ -1340,7 +1668,6 @@
         </w:rPr>
         <w:t>.1.</w:t>
       </w:r>
-      <w:proofErr w:type="gramEnd"/>
       <w:r>
         <w:rPr>
           <w:rFonts w:asciiTheme="majorHAnsi" w:hAnsiTheme="majorHAnsi" w:cs="Times New Roman"/>
@@ -1479,7 +1806,7 @@
                     <pic:cNvPicPr/>
                   </pic:nvPicPr>
                   <pic:blipFill>
-                    <a:blip r:embed="rId10"/>
+                    <a:blip r:embed="rId14"/>
                     <a:stretch>
                       <a:fillRect/>
                     </a:stretch>
@@ -1675,7 +2002,7 @@
                     <pic:cNvPicPr/>
                   </pic:nvPicPr>
                   <pic:blipFill>
-                    <a:blip r:embed="rId11">
+                    <a:blip r:embed="rId15">
                       <a:extLst>
                         <a:ext uri="{28A0092B-C50C-407E-A947-70E740481C1C}">
                           <a14:useLocalDpi xmlns:a14="http://schemas.microsoft.com/office/drawing/2010/main" val="0"/>
@@ -1812,7 +2139,7 @@
                     <pic:cNvPicPr/>
                   </pic:nvPicPr>
                   <pic:blipFill>
-                    <a:blip r:embed="rId12"/>
+                    <a:blip r:embed="rId16"/>
                     <a:stretch>
                       <a:fillRect/>
                     </a:stretch>
@@ -1868,7 +2195,6 @@
         </w:rPr>
         <w:t>.</w:t>
       </w:r>
-      <w:proofErr w:type="gramStart"/>
       <w:r>
         <w:rPr>
           <w:rFonts w:asciiTheme="majorHAnsi" w:hAnsiTheme="majorHAnsi" w:cs="Times New Roman"/>
@@ -1883,16 +2209,7 @@
           <w:b/>
           <w:bCs/>
         </w:rPr>
-        <w:t>Traffic</w:t>
-      </w:r>
-      <w:proofErr w:type="gramEnd"/>
-      <w:r>
-        <w:rPr>
-          <w:rFonts w:asciiTheme="majorHAnsi" w:hAnsiTheme="majorHAnsi" w:cs="Times New Roman"/>
-          <w:b/>
-          <w:bCs/>
-        </w:rPr>
-        <w:t xml:space="preserve"> Volume by Day of the Week</w:t>
+        <w:t>Traffic Volume by Day of the Week</w:t>
       </w:r>
     </w:p>
     <w:p>
@@ -1962,7 +2279,7 @@
                     <pic:cNvPicPr/>
                   </pic:nvPicPr>
                   <pic:blipFill>
-                    <a:blip r:embed="rId13"/>
+                    <a:blip r:embed="rId17"/>
                     <a:stretch>
                       <a:fillRect/>
                     </a:stretch>
@@ -2364,6 +2681,7 @@
       <w:r>
         <w:rPr>
           <w:rFonts w:ascii="Times New Roman" w:hAnsi="Times New Roman" w:cs="Times New Roman"/>
+          <w:noProof/>
           <w:sz w:val="28"/>
           <w:szCs w:val="28"/>
         </w:rPr>
@@ -2383,7 +2701,7 @@
                     <pic:cNvPicPr/>
                   </pic:nvPicPr>
                   <pic:blipFill>
-                    <a:blip r:embed="rId14"/>
+                    <a:blip r:embed="rId18"/>
                     <a:stretch>
                       <a:fillRect/>
                     </a:stretch>
@@ -2423,7 +2741,7 @@
           <w:szCs w:val="32"/>
         </w:rPr>
         <w:lastRenderedPageBreak/>
-        <w:t>9</w:t>
+        <w:t>8</w:t>
       </w:r>
       <w:r>
         <w:rPr>
@@ -2698,6 +3016,7 @@
                 <w:szCs w:val="28"/>
               </w:rPr>
             </w:pPr>
+            <w:proofErr w:type="spellStart"/>
             <w:r>
               <w:rPr>
                 <w:rFonts w:ascii="Times New Roman" w:hAnsi="Times New Roman" w:cs="Times New Roman"/>
@@ -2712,7 +3031,16 @@
                 <w:sz w:val="28"/>
                 <w:szCs w:val="28"/>
               </w:rPr>
-              <w:t>Boost Regressor</w:t>
+              <w:t>Boost</w:t>
+            </w:r>
+            <w:proofErr w:type="spellEnd"/>
+            <w:r>
+              <w:rPr>
+                <w:rFonts w:ascii="Times New Roman" w:hAnsi="Times New Roman" w:cs="Times New Roman"/>
+                <w:sz w:val="28"/>
+                <w:szCs w:val="28"/>
+              </w:rPr>
+              <w:t xml:space="preserve"> Regressor</w:t>
             </w:r>
           </w:p>
         </w:tc>
@@ -2770,6 +3098,7 @@
                 <w:szCs w:val="28"/>
               </w:rPr>
             </w:pPr>
+            <w:proofErr w:type="spellStart"/>
             <w:r>
               <w:rPr>
                 <w:rFonts w:ascii="Times New Roman" w:hAnsi="Times New Roman" w:cs="Times New Roman"/>
@@ -2786,6 +3115,7 @@
               </w:rPr>
               <w:t>GBM</w:t>
             </w:r>
+            <w:proofErr w:type="spellEnd"/>
             <w:r>
               <w:rPr>
                 <w:rFonts w:ascii="Times New Roman" w:hAnsi="Times New Roman" w:cs="Times New Roman"/>
@@ -2912,7 +3242,7 @@
                     <pic:cNvPicPr/>
                   </pic:nvPicPr>
                   <pic:blipFill>
-                    <a:blip r:embed="rId15">
+                    <a:blip r:embed="rId19">
                       <a:extLst>
                         <a:ext uri="{28A0092B-C50C-407E-A947-70E740481C1C}">
                           <a14:useLocalDpi xmlns:a14="http://schemas.microsoft.com/office/drawing/2010/main" val="0"/>
@@ -2993,172 +3323,9 @@
           <w:sz w:val="32"/>
           <w:szCs w:val="32"/>
         </w:rPr>
-        <w:t>10. MODEL EVALUATION</w:t>
-      </w:r>
-    </w:p>
-    <w:p>
-      <w:pPr>
-        <w:rPr>
-          <w:rFonts w:ascii="Times New Roman" w:hAnsi="Times New Roman" w:cs="Times New Roman"/>
-          <w:sz w:val="28"/>
-          <w:szCs w:val="28"/>
-        </w:rPr>
-      </w:pPr>
-      <w:r>
-        <w:rPr>
-          <w:rFonts w:ascii="Times New Roman" w:hAnsi="Times New Roman" w:cs="Times New Roman"/>
-          <w:sz w:val="28"/>
-          <w:szCs w:val="28"/>
-        </w:rPr>
-        <w:t>The performance of each regression model was evaluated using the following regression metrics.</w:t>
-      </w:r>
-    </w:p>
-    <w:p>
-      <w:pPr>
-        <w:rPr>
-          <w:rFonts w:ascii="Times New Roman" w:hAnsi="Times New Roman" w:cs="Times New Roman"/>
-          <w:sz w:val="28"/>
-          <w:szCs w:val="28"/>
-        </w:rPr>
-      </w:pPr>
-      <w:r>
-        <w:rPr>
-          <w:rFonts w:ascii="Times New Roman" w:hAnsi="Times New Roman" w:cs="Times New Roman"/>
-          <w:b/>
-          <w:bCs/>
-          <w:sz w:val="28"/>
-          <w:szCs w:val="28"/>
-        </w:rPr>
-        <w:t>Mean Absolute Error (MAE)</w:t>
-      </w:r>
-    </w:p>
-    <w:p>
-      <w:pPr>
-        <w:rPr>
-          <w:rFonts w:ascii="Times New Roman" w:hAnsi="Times New Roman" w:cs="Times New Roman"/>
-          <w:sz w:val="28"/>
-          <w:szCs w:val="28"/>
-        </w:rPr>
-      </w:pPr>
-      <w:r>
-        <w:rPr>
-          <w:rFonts w:ascii="Times New Roman" w:hAnsi="Times New Roman" w:cs="Times New Roman"/>
-          <w:sz w:val="28"/>
-          <w:szCs w:val="28"/>
-        </w:rPr>
-        <w:t>Measures the average absolute difference between predicted and actual traffic volume. Lower values indicate better performance.</w:t>
-      </w:r>
-    </w:p>
-    <w:p>
-      <w:pPr>
-        <w:rPr>
-          <w:rFonts w:ascii="Times New Roman" w:hAnsi="Times New Roman" w:cs="Times New Roman"/>
-          <w:sz w:val="28"/>
-          <w:szCs w:val="28"/>
-        </w:rPr>
-      </w:pPr>
-      <w:r>
-        <w:rPr>
-          <w:rFonts w:ascii="Times New Roman" w:hAnsi="Times New Roman" w:cs="Times New Roman"/>
-          <w:b/>
-          <w:bCs/>
-          <w:sz w:val="28"/>
-          <w:szCs w:val="28"/>
-        </w:rPr>
-        <w:t>Mean Squared Error (MSE)</w:t>
-      </w:r>
-    </w:p>
-    <w:p>
-      <w:pPr>
-        <w:rPr>
-          <w:rFonts w:ascii="Times New Roman" w:hAnsi="Times New Roman" w:cs="Times New Roman"/>
-          <w:sz w:val="28"/>
-          <w:szCs w:val="28"/>
-        </w:rPr>
-      </w:pPr>
-      <w:r>
-        <w:rPr>
-          <w:rFonts w:ascii="Times New Roman" w:hAnsi="Times New Roman" w:cs="Times New Roman"/>
-          <w:sz w:val="28"/>
-          <w:szCs w:val="28"/>
-        </w:rPr>
-        <w:t>Measures the average squared prediction error. It penalizes larger errors more heavily.</w:t>
-      </w:r>
-    </w:p>
-    <w:p>
-      <w:pPr>
-        <w:rPr>
-          <w:rFonts w:ascii="Times New Roman" w:hAnsi="Times New Roman" w:cs="Times New Roman"/>
-          <w:sz w:val="28"/>
-          <w:szCs w:val="28"/>
-        </w:rPr>
-      </w:pPr>
-      <w:r>
-        <w:rPr>
-          <w:rFonts w:ascii="Times New Roman" w:hAnsi="Times New Roman" w:cs="Times New Roman"/>
-          <w:b/>
-          <w:bCs/>
-          <w:sz w:val="28"/>
-          <w:szCs w:val="28"/>
-        </w:rPr>
-        <w:t>Root Mean Squared Error (RMSE)</w:t>
-      </w:r>
-    </w:p>
-    <w:p>
-      <w:pPr>
-        <w:rPr>
-          <w:rFonts w:ascii="Times New Roman" w:hAnsi="Times New Roman" w:cs="Times New Roman"/>
-          <w:sz w:val="28"/>
-          <w:szCs w:val="28"/>
-        </w:rPr>
-      </w:pPr>
-      <w:r>
-        <w:rPr>
-          <w:rFonts w:ascii="Times New Roman" w:hAnsi="Times New Roman" w:cs="Times New Roman"/>
-          <w:sz w:val="28"/>
-          <w:szCs w:val="28"/>
-        </w:rPr>
-        <w:t>Represents the standard deviation of prediction errors and is expressed in the same unit as the target variable.</w:t>
-      </w:r>
-    </w:p>
-    <w:p>
-      <w:pPr>
-        <w:rPr>
-          <w:rFonts w:ascii="Times New Roman" w:hAnsi="Times New Roman" w:cs="Times New Roman"/>
-          <w:sz w:val="28"/>
-          <w:szCs w:val="28"/>
-        </w:rPr>
-      </w:pPr>
-      <w:r>
-        <w:rPr>
-          <w:rFonts w:ascii="Times New Roman" w:hAnsi="Times New Roman" w:cs="Times New Roman"/>
-          <w:b/>
-          <w:bCs/>
-          <w:sz w:val="28"/>
-          <w:szCs w:val="28"/>
-        </w:rPr>
-        <w:t>R² Score</w:t>
-      </w:r>
-    </w:p>
-    <w:p>
-      <w:pPr>
-        <w:rPr>
-          <w:rFonts w:ascii="Times New Roman" w:hAnsi="Times New Roman" w:cs="Times New Roman"/>
-          <w:sz w:val="28"/>
-          <w:szCs w:val="28"/>
-        </w:rPr>
-      </w:pPr>
-      <w:r>
-        <w:rPr>
-          <w:rFonts w:ascii="Times New Roman" w:hAnsi="Times New Roman" w:cs="Times New Roman"/>
-          <w:sz w:val="28"/>
-          <w:szCs w:val="28"/>
-        </w:rPr>
-        <w:t>Indicates how well the model explains the variance in traffic volume. Values closer to 1 indicate better prediction accuracy.</w:t>
-      </w:r>
-    </w:p>
-    <w:p>
-      <w:pPr>
+        <w:t>9</w:t>
+      </w:r>
+      <w:r>
         <w:rPr>
           <w:rFonts w:asciiTheme="majorHAnsi" w:hAnsiTheme="majorHAnsi" w:cs="Times New Roman"/>
           <w:b/>
@@ -3166,8 +3333,172 @@
           <w:sz w:val="32"/>
           <w:szCs w:val="32"/>
         </w:rPr>
-      </w:pPr>
-      <w:r>
+        <w:t>. MODEL EVALUATION</w:t>
+      </w:r>
+    </w:p>
+    <w:p>
+      <w:pPr>
+        <w:rPr>
+          <w:rFonts w:ascii="Times New Roman" w:hAnsi="Times New Roman" w:cs="Times New Roman"/>
+          <w:sz w:val="28"/>
+          <w:szCs w:val="28"/>
+        </w:rPr>
+      </w:pPr>
+      <w:r>
+        <w:rPr>
+          <w:rFonts w:ascii="Times New Roman" w:hAnsi="Times New Roman" w:cs="Times New Roman"/>
+          <w:sz w:val="28"/>
+          <w:szCs w:val="28"/>
+        </w:rPr>
+        <w:t>The performance of each regression model was evaluated using the following regression metrics.</w:t>
+      </w:r>
+    </w:p>
+    <w:p>
+      <w:pPr>
+        <w:rPr>
+          <w:rFonts w:ascii="Times New Roman" w:hAnsi="Times New Roman" w:cs="Times New Roman"/>
+          <w:sz w:val="28"/>
+          <w:szCs w:val="28"/>
+        </w:rPr>
+      </w:pPr>
+      <w:r>
+        <w:rPr>
+          <w:rFonts w:ascii="Times New Roman" w:hAnsi="Times New Roman" w:cs="Times New Roman"/>
+          <w:b/>
+          <w:bCs/>
+          <w:sz w:val="28"/>
+          <w:szCs w:val="28"/>
+        </w:rPr>
+        <w:t>Mean Absolute Error (MAE)</w:t>
+      </w:r>
+    </w:p>
+    <w:p>
+      <w:pPr>
+        <w:rPr>
+          <w:rFonts w:ascii="Times New Roman" w:hAnsi="Times New Roman" w:cs="Times New Roman"/>
+          <w:sz w:val="28"/>
+          <w:szCs w:val="28"/>
+        </w:rPr>
+      </w:pPr>
+      <w:r>
+        <w:rPr>
+          <w:rFonts w:ascii="Times New Roman" w:hAnsi="Times New Roman" w:cs="Times New Roman"/>
+          <w:sz w:val="28"/>
+          <w:szCs w:val="28"/>
+        </w:rPr>
+        <w:t>Measures the average absolute difference between predicted and actual traffic volume. Lower values indicate better performance.</w:t>
+      </w:r>
+    </w:p>
+    <w:p>
+      <w:pPr>
+        <w:rPr>
+          <w:rFonts w:ascii="Times New Roman" w:hAnsi="Times New Roman" w:cs="Times New Roman"/>
+          <w:sz w:val="28"/>
+          <w:szCs w:val="28"/>
+        </w:rPr>
+      </w:pPr>
+      <w:r>
+        <w:rPr>
+          <w:rFonts w:ascii="Times New Roman" w:hAnsi="Times New Roman" w:cs="Times New Roman"/>
+          <w:b/>
+          <w:bCs/>
+          <w:sz w:val="28"/>
+          <w:szCs w:val="28"/>
+        </w:rPr>
+        <w:t>Mean Squared Error (MSE)</w:t>
+      </w:r>
+    </w:p>
+    <w:p>
+      <w:pPr>
+        <w:rPr>
+          <w:rFonts w:ascii="Times New Roman" w:hAnsi="Times New Roman" w:cs="Times New Roman"/>
+          <w:sz w:val="28"/>
+          <w:szCs w:val="28"/>
+        </w:rPr>
+      </w:pPr>
+      <w:r>
+        <w:rPr>
+          <w:rFonts w:ascii="Times New Roman" w:hAnsi="Times New Roman" w:cs="Times New Roman"/>
+          <w:sz w:val="28"/>
+          <w:szCs w:val="28"/>
+        </w:rPr>
+        <w:t>Measures the average squared prediction error. It penalizes larger errors more heavily.</w:t>
+      </w:r>
+    </w:p>
+    <w:p>
+      <w:pPr>
+        <w:rPr>
+          <w:rFonts w:ascii="Times New Roman" w:hAnsi="Times New Roman" w:cs="Times New Roman"/>
+          <w:sz w:val="28"/>
+          <w:szCs w:val="28"/>
+        </w:rPr>
+      </w:pPr>
+      <w:r>
+        <w:rPr>
+          <w:rFonts w:ascii="Times New Roman" w:hAnsi="Times New Roman" w:cs="Times New Roman"/>
+          <w:b/>
+          <w:bCs/>
+          <w:sz w:val="28"/>
+          <w:szCs w:val="28"/>
+        </w:rPr>
+        <w:t>Root Mean Squared Error (RMSE)</w:t>
+      </w:r>
+    </w:p>
+    <w:p>
+      <w:pPr>
+        <w:rPr>
+          <w:rFonts w:ascii="Times New Roman" w:hAnsi="Times New Roman" w:cs="Times New Roman"/>
+          <w:sz w:val="28"/>
+          <w:szCs w:val="28"/>
+        </w:rPr>
+      </w:pPr>
+      <w:r>
+        <w:rPr>
+          <w:rFonts w:ascii="Times New Roman" w:hAnsi="Times New Roman" w:cs="Times New Roman"/>
+          <w:sz w:val="28"/>
+          <w:szCs w:val="28"/>
+        </w:rPr>
+        <w:t>Represents the standard deviation of prediction errors and is expressed in the same unit as the target variable.</w:t>
+      </w:r>
+    </w:p>
+    <w:p>
+      <w:pPr>
+        <w:rPr>
+          <w:rFonts w:ascii="Times New Roman" w:hAnsi="Times New Roman" w:cs="Times New Roman"/>
+          <w:sz w:val="28"/>
+          <w:szCs w:val="28"/>
+        </w:rPr>
+      </w:pPr>
+      <w:r>
+        <w:rPr>
+          <w:rFonts w:ascii="Times New Roman" w:hAnsi="Times New Roman" w:cs="Times New Roman"/>
+          <w:b/>
+          <w:bCs/>
+          <w:sz w:val="28"/>
+          <w:szCs w:val="28"/>
+        </w:rPr>
+        <w:t>R² Score</w:t>
+      </w:r>
+    </w:p>
+    <w:p>
+      <w:pPr>
+        <w:rPr>
+          <w:rFonts w:ascii="Times New Roman" w:hAnsi="Times New Roman" w:cs="Times New Roman"/>
+          <w:sz w:val="28"/>
+          <w:szCs w:val="28"/>
+        </w:rPr>
+      </w:pPr>
+      <w:r>
+        <w:rPr>
+          <w:rFonts w:ascii="Times New Roman" w:hAnsi="Times New Roman" w:cs="Times New Roman"/>
+          <w:sz w:val="28"/>
+          <w:szCs w:val="28"/>
+        </w:rPr>
+        <w:t>Indicates how well the model explains the variance in traffic volume. Values closer to 1 indicate better prediction accuracy.</w:t>
+      </w:r>
+    </w:p>
+    <w:p>
+      <w:pPr>
         <w:rPr>
           <w:rFonts w:asciiTheme="majorHAnsi" w:hAnsiTheme="majorHAnsi" w:cs="Times New Roman"/>
           <w:b/>
@@ -3175,7 +3506,36 @@
           <w:sz w:val="32"/>
           <w:szCs w:val="32"/>
         </w:rPr>
-        <w:t xml:space="preserve">11. </w:t>
+      </w:pPr>
+      <w:r>
+        <w:rPr>
+          <w:rFonts w:asciiTheme="majorHAnsi" w:hAnsiTheme="majorHAnsi" w:cs="Times New Roman"/>
+          <w:b/>
+          <w:bCs/>
+          <w:sz w:val="32"/>
+          <w:szCs w:val="32"/>
+        </w:rPr>
+        <w:t>1</w:t>
+      </w:r>
+      <w:r>
+        <w:rPr>
+          <w:rFonts w:asciiTheme="majorHAnsi" w:hAnsiTheme="majorHAnsi" w:cs="Times New Roman"/>
+          <w:b/>
+          <w:bCs/>
+          <w:sz w:val="32"/>
+          <w:szCs w:val="32"/>
+        </w:rPr>
+        <w:t>0</w:t>
+      </w:r>
+      <w:r>
+        <w:rPr>
+          <w:rFonts w:asciiTheme="majorHAnsi" w:hAnsiTheme="majorHAnsi" w:cs="Times New Roman"/>
+          <w:b/>
+          <w:bCs/>
+          <w:sz w:val="32"/>
+          <w:szCs w:val="32"/>
+        </w:rPr>
+        <w:t xml:space="preserve">. </w:t>
       </w:r>
       <w:r>
         <w:rPr>
@@ -3564,13 +3924,23 @@
                 <w:szCs w:val="28"/>
               </w:rPr>
             </w:pPr>
+            <w:proofErr w:type="spellStart"/>
             <w:r>
               <w:rPr>
                 <w:rFonts w:ascii="Times New Roman" w:hAnsi="Times New Roman" w:cs="Times New Roman"/>
                 <w:sz w:val="28"/>
                 <w:szCs w:val="28"/>
               </w:rPr>
-              <w:t>XGBoost Regressor</w:t>
+              <w:t>XGBoost</w:t>
+            </w:r>
+            <w:proofErr w:type="spellEnd"/>
+            <w:r>
+              <w:rPr>
+                <w:rFonts w:ascii="Times New Roman" w:hAnsi="Times New Roman" w:cs="Times New Roman"/>
+                <w:sz w:val="28"/>
+                <w:szCs w:val="28"/>
+              </w:rPr>
+              <w:t xml:space="preserve"> Regressor</w:t>
             </w:r>
           </w:p>
         </w:tc>
@@ -3705,13 +4075,23 @@
                 <w:szCs w:val="28"/>
               </w:rPr>
             </w:pPr>
+            <w:proofErr w:type="spellStart"/>
             <w:r>
               <w:rPr>
                 <w:rFonts w:ascii="Times New Roman" w:hAnsi="Times New Roman" w:cs="Times New Roman"/>
                 <w:sz w:val="28"/>
                 <w:szCs w:val="28"/>
               </w:rPr>
-              <w:t>LightGBM Regressor</w:t>
+              <w:t>LightGBM</w:t>
+            </w:r>
+            <w:proofErr w:type="spellEnd"/>
+            <w:r>
+              <w:rPr>
+                <w:rFonts w:ascii="Times New Roman" w:hAnsi="Times New Roman" w:cs="Times New Roman"/>
+                <w:sz w:val="28"/>
+                <w:szCs w:val="28"/>
+              </w:rPr>
+              <w:t xml:space="preserve"> Regressor</w:t>
             </w:r>
           </w:p>
         </w:tc>
@@ -3974,13 +4354,41 @@
           <w:szCs w:val="28"/>
         </w:rPr>
       </w:pPr>
-      <w:r>
-        <w:rPr>
-          <w:rFonts w:ascii="Times New Roman" w:hAnsi="Times New Roman" w:cs="Times New Roman"/>
-          <w:sz w:val="28"/>
-          <w:szCs w:val="28"/>
-        </w:rPr>
-        <w:t>GridSearchCV was used to search for the best hyperparameter combinations using cross-validation. The optimized parameters obtained from GridSearchCV were then used to retrain each regression model.</w:t>
+      <w:proofErr w:type="spellStart"/>
+      <w:r>
+        <w:rPr>
+          <w:rFonts w:ascii="Times New Roman" w:hAnsi="Times New Roman" w:cs="Times New Roman"/>
+          <w:sz w:val="28"/>
+          <w:szCs w:val="28"/>
+        </w:rPr>
+        <w:t>GridSearchCV</w:t>
+      </w:r>
+      <w:proofErr w:type="spellEnd"/>
+      <w:r>
+        <w:rPr>
+          <w:rFonts w:ascii="Times New Roman" w:hAnsi="Times New Roman" w:cs="Times New Roman"/>
+          <w:sz w:val="28"/>
+          <w:szCs w:val="28"/>
+        </w:rPr>
+        <w:t xml:space="preserve"> was used to search for the best hyperparameter combinations using cross-validation. The optimized parameters obtained from </w:t>
+      </w:r>
+      <w:proofErr w:type="spellStart"/>
+      <w:r>
+        <w:rPr>
+          <w:rFonts w:ascii="Times New Roman" w:hAnsi="Times New Roman" w:cs="Times New Roman"/>
+          <w:sz w:val="28"/>
+          <w:szCs w:val="28"/>
+        </w:rPr>
+        <w:t>GridSearchCV</w:t>
+      </w:r>
+      <w:proofErr w:type="spellEnd"/>
+      <w:r>
+        <w:rPr>
+          <w:rFonts w:ascii="Times New Roman" w:hAnsi="Times New Roman" w:cs="Times New Roman"/>
+          <w:sz w:val="28"/>
+          <w:szCs w:val="28"/>
+        </w:rPr>
+        <w:t xml:space="preserve"> were then used to retrain each regression model.</w:t>
       </w:r>
     </w:p>
     <w:p>
@@ -4363,8 +4771,18 @@
                 <w:sz w:val="28"/>
                 <w:szCs w:val="28"/>
               </w:rPr>
-              <w:t>Optimized XGBoost</w:t>
+              <w:t xml:space="preserve">Optimized </w:t>
             </w:r>
+            <w:proofErr w:type="spellStart"/>
+            <w:r>
+              <w:rPr>
+                <w:rFonts w:ascii="Times New Roman" w:hAnsi="Times New Roman" w:cs="Times New Roman"/>
+                <w:sz w:val="28"/>
+                <w:szCs w:val="28"/>
+              </w:rPr>
+              <w:t>XGBoost</w:t>
+            </w:r>
+            <w:proofErr w:type="spellEnd"/>
           </w:p>
         </w:tc>
         <w:tc>
@@ -4510,8 +4928,18 @@
                 <w:sz w:val="28"/>
                 <w:szCs w:val="28"/>
               </w:rPr>
-              <w:t>Optimized LightGBM</w:t>
+              <w:t xml:space="preserve">Optimized </w:t>
             </w:r>
+            <w:proofErr w:type="spellStart"/>
+            <w:r>
+              <w:rPr>
+                <w:rFonts w:ascii="Times New Roman" w:hAnsi="Times New Roman" w:cs="Times New Roman"/>
+                <w:sz w:val="28"/>
+                <w:szCs w:val="28"/>
+              </w:rPr>
+              <w:t>LightGBM</w:t>
+            </w:r>
+            <w:proofErr w:type="spellEnd"/>
           </w:p>
         </w:tc>
         <w:tc>
@@ -4672,7 +5100,49 @@
         <w:rPr>
           <w:rFonts w:ascii="Times New Roman" w:hAnsi="Times New Roman" w:cs="Times New Roman"/>
         </w:rPr>
-        <w:t>Hyperparameter tuning improved the performance of the XGBoost and LightGBM models. Among the optimized models, XGBoost achieved the lowest prediction errors and the highest R² score, making it the best-performing model after optimization.</w:t>
+        <w:t xml:space="preserve">Hyperparameter tuning improved the performance of the </w:t>
+      </w:r>
+      <w:proofErr w:type="spellStart"/>
+      <w:r>
+        <w:rPr>
+          <w:rFonts w:ascii="Times New Roman" w:hAnsi="Times New Roman" w:cs="Times New Roman"/>
+        </w:rPr>
+        <w:t>XGBoost</w:t>
+      </w:r>
+      <w:proofErr w:type="spellEnd"/>
+      <w:r>
+        <w:rPr>
+          <w:rFonts w:ascii="Times New Roman" w:hAnsi="Times New Roman" w:cs="Times New Roman"/>
+        </w:rPr>
+        <w:t xml:space="preserve"> and </w:t>
+      </w:r>
+      <w:proofErr w:type="spellStart"/>
+      <w:r>
+        <w:rPr>
+          <w:rFonts w:ascii="Times New Roman" w:hAnsi="Times New Roman" w:cs="Times New Roman"/>
+        </w:rPr>
+        <w:t>LightGBM</w:t>
+      </w:r>
+      <w:proofErr w:type="spellEnd"/>
+      <w:r>
+        <w:rPr>
+          <w:rFonts w:ascii="Times New Roman" w:hAnsi="Times New Roman" w:cs="Times New Roman"/>
+        </w:rPr>
+        <w:t xml:space="preserve"> models. Among the optimized models, </w:t>
+      </w:r>
+      <w:proofErr w:type="spellStart"/>
+      <w:r>
+        <w:rPr>
+          <w:rFonts w:ascii="Times New Roman" w:hAnsi="Times New Roman" w:cs="Times New Roman"/>
+        </w:rPr>
+        <w:t>XGBoost</w:t>
+      </w:r>
+      <w:proofErr w:type="spellEnd"/>
+      <w:r>
+        <w:rPr>
+          <w:rFonts w:ascii="Times New Roman" w:hAnsi="Times New Roman" w:cs="Times New Roman"/>
+        </w:rPr>
+        <w:t xml:space="preserve"> achieved the lowest prediction errors and the highest R² score, making it the best-performing model after optimization.</w:t>
       </w:r>
     </w:p>
     <w:p>
@@ -4805,7 +5275,43 @@
           <w:sz w:val="28"/>
           <w:szCs w:val="28"/>
         </w:rPr>
-        <w:t>A weighted ensemble technique was used by assigning different weights to the predictions generated by the optimized Random Forest, XGBoost, and LightGBM models. The final prediction was calculated as the weighted average of the individual model predictions.</w:t>
+        <w:t xml:space="preserve">A weighted ensemble technique was used by assigning different weights to the predictions generated by the optimized Random Forest, </w:t>
+      </w:r>
+      <w:proofErr w:type="spellStart"/>
+      <w:r>
+        <w:rPr>
+          <w:rFonts w:ascii="Times New Roman" w:hAnsi="Times New Roman" w:cs="Times New Roman"/>
+          <w:sz w:val="28"/>
+          <w:szCs w:val="28"/>
+        </w:rPr>
+        <w:t>XGBoost</w:t>
+      </w:r>
+      <w:proofErr w:type="spellEnd"/>
+      <w:r>
+        <w:rPr>
+          <w:rFonts w:ascii="Times New Roman" w:hAnsi="Times New Roman" w:cs="Times New Roman"/>
+          <w:sz w:val="28"/>
+          <w:szCs w:val="28"/>
+        </w:rPr>
+        <w:t xml:space="preserve">, and </w:t>
+      </w:r>
+      <w:proofErr w:type="spellStart"/>
+      <w:r>
+        <w:rPr>
+          <w:rFonts w:ascii="Times New Roman" w:hAnsi="Times New Roman" w:cs="Times New Roman"/>
+          <w:sz w:val="28"/>
+          <w:szCs w:val="28"/>
+        </w:rPr>
+        <w:t>LightGBM</w:t>
+      </w:r>
+      <w:proofErr w:type="spellEnd"/>
+      <w:r>
+        <w:rPr>
+          <w:rFonts w:ascii="Times New Roman" w:hAnsi="Times New Roman" w:cs="Times New Roman"/>
+          <w:sz w:val="28"/>
+          <w:szCs w:val="28"/>
+        </w:rPr>
+        <w:t xml:space="preserve"> models. The final prediction was calculated as the weighted average of the individual model predictions.</w:t>
       </w:r>
     </w:p>
     <w:p>
@@ -5394,6 +5900,7 @@
                 <w:szCs w:val="28"/>
               </w:rPr>
             </w:pPr>
+            <w:proofErr w:type="spellStart"/>
             <w:r>
               <w:rPr>
                 <w:rFonts w:ascii="Times New Roman" w:hAnsi="Times New Roman" w:cs="Times New Roman"/>
@@ -5401,7 +5908,17 @@
                 <w:sz w:val="28"/>
                 <w:szCs w:val="28"/>
               </w:rPr>
-              <w:t>XGBoost (Optimized)</w:t>
+              <w:t>XGBoost</w:t>
+            </w:r>
+            <w:proofErr w:type="spellEnd"/>
+            <w:r>
+              <w:rPr>
+                <w:rFonts w:ascii="Times New Roman" w:hAnsi="Times New Roman" w:cs="Times New Roman"/>
+                <w:iCs/>
+                <w:sz w:val="28"/>
+                <w:szCs w:val="28"/>
+              </w:rPr>
+              <w:t xml:space="preserve"> (Optimized)</w:t>
             </w:r>
           </w:p>
         </w:tc>
@@ -5545,6 +6062,7 @@
                 <w:szCs w:val="28"/>
               </w:rPr>
             </w:pPr>
+            <w:proofErr w:type="spellStart"/>
             <w:r>
               <w:rPr>
                 <w:rFonts w:ascii="Times New Roman" w:hAnsi="Times New Roman" w:cs="Times New Roman"/>
@@ -5552,7 +6070,17 @@
                 <w:sz w:val="28"/>
                 <w:szCs w:val="28"/>
               </w:rPr>
-              <w:t>LightGBM (Optimized)</w:t>
+              <w:t>LightGBM</w:t>
+            </w:r>
+            <w:proofErr w:type="spellEnd"/>
+            <w:r>
+              <w:rPr>
+                <w:rFonts w:ascii="Times New Roman" w:hAnsi="Times New Roman" w:cs="Times New Roman"/>
+                <w:iCs/>
+                <w:sz w:val="28"/>
+                <w:szCs w:val="28"/>
+              </w:rPr>
+              <w:t xml:space="preserve"> (Optimized)</w:t>
             </w:r>
           </w:p>
         </w:tc>
@@ -5947,7 +6475,39 @@
           <w:rFonts w:ascii="Times New Roman" w:hAnsi="Times New Roman" w:cs="Times New Roman"/>
           <w:iCs/>
         </w:rPr>
-        <w:t>The weighted ensemble model achieved highly accurate predictions by combining multiple optimized models. However, the optimized XGBoost model still produced the lowest prediction error and the highest R² score. Therefore, XGBoost was selected as the final deployment model.</w:t>
+        <w:t xml:space="preserve">The weighted ensemble model achieved highly accurate predictions by combining multiple optimized models. However, the optimized </w:t>
+      </w:r>
+      <w:proofErr w:type="spellStart"/>
+      <w:r>
+        <w:rPr>
+          <w:rFonts w:ascii="Times New Roman" w:hAnsi="Times New Roman" w:cs="Times New Roman"/>
+          <w:iCs/>
+        </w:rPr>
+        <w:t>XGBoost</w:t>
+      </w:r>
+      <w:proofErr w:type="spellEnd"/>
+      <w:r>
+        <w:rPr>
+          <w:rFonts w:ascii="Times New Roman" w:hAnsi="Times New Roman" w:cs="Times New Roman"/>
+          <w:iCs/>
+        </w:rPr>
+        <w:t xml:space="preserve"> model still produced the lowest prediction error and the highest R² score. Therefore, </w:t>
+      </w:r>
+      <w:proofErr w:type="spellStart"/>
+      <w:r>
+        <w:rPr>
+          <w:rFonts w:ascii="Times New Roman" w:hAnsi="Times New Roman" w:cs="Times New Roman"/>
+          <w:iCs/>
+        </w:rPr>
+        <w:t>XGBoost</w:t>
+      </w:r>
+      <w:proofErr w:type="spellEnd"/>
+      <w:r>
+        <w:rPr>
+          <w:rFonts w:ascii="Times New Roman" w:hAnsi="Times New Roman" w:cs="Times New Roman"/>
+          <w:iCs/>
+        </w:rPr>
+        <w:t xml:space="preserve"> was selected as the final deployment model.</w:t>
       </w:r>
     </w:p>
     <w:p>
@@ -6035,7 +6595,27 @@
           <w:sz w:val="28"/>
           <w:szCs w:val="28"/>
         </w:rPr>
-        <w:t>Based on the evaluation results obtained from the baseline models, hyperparameter tuning, and ensemble learning, the Optimized XGBoost Regressor was selected as the final model for de</w:t>
+        <w:t xml:space="preserve">Based on the evaluation results obtained from the baseline models, hyperparameter tuning, and ensemble learning, the Optimized </w:t>
+      </w:r>
+      <w:proofErr w:type="spellStart"/>
+      <w:r>
+        <w:rPr>
+          <w:rFonts w:ascii="Times New Roman" w:hAnsi="Times New Roman" w:cs="Times New Roman"/>
+          <w:iCs/>
+          <w:sz w:val="28"/>
+          <w:szCs w:val="28"/>
+        </w:rPr>
+        <w:t>XGBoost</w:t>
+      </w:r>
+      <w:proofErr w:type="spellEnd"/>
+      <w:r>
+        <w:rPr>
+          <w:rFonts w:ascii="Times New Roman" w:hAnsi="Times New Roman" w:cs="Times New Roman"/>
+          <w:iCs/>
+          <w:sz w:val="28"/>
+          <w:szCs w:val="28"/>
+        </w:rPr>
+        <w:t xml:space="preserve"> Regressor was selected as the final model for de</w:t>
       </w:r>
       <w:r>
         <w:rPr>
@@ -6067,8 +6647,21 @@
           <w:sz w:val="28"/>
           <w:szCs w:val="28"/>
         </w:rPr>
-        <w:t>Reasons for Selecting XGBoost</w:t>
-      </w:r>
+        <w:t xml:space="preserve">Reasons for Selecting </w:t>
+      </w:r>
+      <w:proofErr w:type="spellStart"/>
+      <w:r>
+        <w:rPr>
+          <w:rFonts w:asciiTheme="majorHAnsi" w:hAnsiTheme="majorHAnsi" w:cs="Times New Roman"/>
+          <w:b/>
+          <w:bCs/>
+          <w:iCs/>
+          <w:sz w:val="28"/>
+          <w:szCs w:val="28"/>
+        </w:rPr>
+        <w:t>XGBoost</w:t>
+      </w:r>
+      <w:proofErr w:type="spellEnd"/>
     </w:p>
     <w:p>
       <w:pPr>
@@ -6674,7 +7267,47 @@
           <w:sz w:val="28"/>
           <w:szCs w:val="28"/>
         </w:rPr>
-        <w:t>A user-friendly web application was developed using Streamlit to demonstrate the traffic prediction system. The application allows users to analyze traffic patterns, predict traffic volume, and visualize important traffic insights through an interactive interface.</w:t>
+        <w:t xml:space="preserve">A user-friendly web application was developed using </w:t>
+      </w:r>
+      <w:proofErr w:type="spellStart"/>
+      <w:r>
+        <w:rPr>
+          <w:rFonts w:ascii="Times New Roman" w:hAnsi="Times New Roman" w:cs="Times New Roman"/>
+          <w:iCs/>
+          <w:sz w:val="28"/>
+          <w:szCs w:val="28"/>
+        </w:rPr>
+        <w:t>Streamlit</w:t>
+      </w:r>
+      <w:proofErr w:type="spellEnd"/>
+      <w:r>
+        <w:rPr>
+          <w:rFonts w:ascii="Times New Roman" w:hAnsi="Times New Roman" w:cs="Times New Roman"/>
+          <w:iCs/>
+          <w:sz w:val="28"/>
+          <w:szCs w:val="28"/>
+        </w:rPr>
+        <w:t xml:space="preserve"> to demonstrate the traffic prediction system. The application allows users to </w:t>
+      </w:r>
+      <w:proofErr w:type="spellStart"/>
+      <w:r>
+        <w:rPr>
+          <w:rFonts w:ascii="Times New Roman" w:hAnsi="Times New Roman" w:cs="Times New Roman"/>
+          <w:iCs/>
+          <w:sz w:val="28"/>
+          <w:szCs w:val="28"/>
+        </w:rPr>
+        <w:t>analyze</w:t>
+      </w:r>
+      <w:proofErr w:type="spellEnd"/>
+      <w:r>
+        <w:rPr>
+          <w:rFonts w:ascii="Times New Roman" w:hAnsi="Times New Roman" w:cs="Times New Roman"/>
+          <w:iCs/>
+          <w:sz w:val="28"/>
+          <w:szCs w:val="28"/>
+        </w:rPr>
+        <w:t xml:space="preserve"> traffic patterns, predict traffic volume, and visualize important traffic insights through an interactive interface.</w:t>
       </w:r>
     </w:p>
     <w:p>
@@ -6809,7 +7442,7 @@
                     <pic:cNvPicPr/>
                   </pic:nvPicPr>
                   <pic:blipFill>
-                    <a:blip r:embed="rId16">
+                    <a:blip r:embed="rId7">
                       <a:extLst>
                         <a:ext uri="{28A0092B-C50C-407E-A947-70E740481C1C}">
                           <a14:useLocalDpi xmlns:a14="http://schemas.microsoft.com/office/drawing/2010/main" val="0"/>
@@ -6907,7 +7540,27 @@
           <w:sz w:val="28"/>
           <w:szCs w:val="28"/>
         </w:rPr>
-        <w:t>The Analytics module enables users to explore different traffic patterns through interactive visualizations. Users can analyze hourly traffic trends, weather impact, road type analysis, day-wise traffic patterns, and feature correlation</w:t>
+        <w:t xml:space="preserve">The Analytics module enables users to explore different traffic patterns through interactive visualizations. Users can </w:t>
+      </w:r>
+      <w:proofErr w:type="spellStart"/>
+      <w:r>
+        <w:rPr>
+          <w:rFonts w:ascii="Times New Roman" w:hAnsi="Times New Roman" w:cs="Times New Roman"/>
+          <w:iCs/>
+          <w:sz w:val="28"/>
+          <w:szCs w:val="28"/>
+        </w:rPr>
+        <w:t>analyze</w:t>
+      </w:r>
+      <w:proofErr w:type="spellEnd"/>
+      <w:r>
+        <w:rPr>
+          <w:rFonts w:ascii="Times New Roman" w:hAnsi="Times New Roman" w:cs="Times New Roman"/>
+          <w:iCs/>
+          <w:sz w:val="28"/>
+          <w:szCs w:val="28"/>
+        </w:rPr>
+        <w:t xml:space="preserve"> hourly traffic trends, weather impact, road type analysis, day-wise traffic patterns, and feature correlation</w:t>
       </w:r>
       <w:r>
         <w:rPr>
@@ -6958,7 +7611,7 @@
                     <pic:cNvPicPr/>
                   </pic:nvPicPr>
                   <pic:blipFill>
-                    <a:blip r:embed="rId17">
+                    <a:blip r:embed="rId20">
                       <a:extLst>
                         <a:ext uri="{28A0092B-C50C-407E-A947-70E740481C1C}">
                           <a14:useLocalDpi xmlns:a14="http://schemas.microsoft.com/office/drawing/2010/main" val="0"/>
@@ -7055,7 +7708,27 @@
           <w:sz w:val="28"/>
           <w:szCs w:val="28"/>
         </w:rPr>
-        <w:t>The Prediction module allows users to enter traffic-related, weather-related, and road-related parameters. Based on the provided inputs, the optimized XGBoost model predicts the expected traffic volume and displays the estimated traffic condition.</w:t>
+        <w:t xml:space="preserve">The Prediction module allows users to enter traffic-related, weather-related, and road-related parameters. Based on the provided inputs, the optimized </w:t>
+      </w:r>
+      <w:proofErr w:type="spellStart"/>
+      <w:r>
+        <w:rPr>
+          <w:rFonts w:ascii="Times New Roman" w:hAnsi="Times New Roman" w:cs="Times New Roman"/>
+          <w:iCs/>
+          <w:sz w:val="28"/>
+          <w:szCs w:val="28"/>
+        </w:rPr>
+        <w:t>XGBoost</w:t>
+      </w:r>
+      <w:proofErr w:type="spellEnd"/>
+      <w:r>
+        <w:rPr>
+          <w:rFonts w:ascii="Times New Roman" w:hAnsi="Times New Roman" w:cs="Times New Roman"/>
+          <w:iCs/>
+          <w:sz w:val="28"/>
+          <w:szCs w:val="28"/>
+        </w:rPr>
+        <w:t xml:space="preserve"> model predicts the expected traffic volume and displays the estimated traffic condition.</w:t>
       </w:r>
     </w:p>
     <w:p>
@@ -7091,7 +7764,7 @@
                     <pic:cNvPicPr/>
                   </pic:nvPicPr>
                   <pic:blipFill>
-                    <a:blip r:embed="rId18"/>
+                    <a:blip r:embed="rId21"/>
                     <a:stretch>
                       <a:fillRect/>
                     </a:stretch>
@@ -7221,7 +7894,7 @@
                     <pic:cNvPicPr/>
                   </pic:nvPicPr>
                   <pic:blipFill>
-                    <a:blip r:embed="rId19">
+                    <a:blip r:embed="rId22">
                       <a:extLst>
                         <a:ext uri="{28A0092B-C50C-407E-A947-70E740481C1C}">
                           <a14:useLocalDpi xmlns:a14="http://schemas.microsoft.com/office/drawing/2010/main" val="0"/>
@@ -7671,6 +8344,7 @@
                 <w:szCs w:val="28"/>
               </w:rPr>
             </w:pPr>
+            <w:proofErr w:type="spellStart"/>
             <w:r>
               <w:rPr>
                 <w:rFonts w:ascii="Times New Roman" w:hAnsi="Times New Roman" w:cs="Times New Roman"/>
@@ -7680,6 +8354,7 @@
               </w:rPr>
               <w:t>XGBoost</w:t>
             </w:r>
+            <w:proofErr w:type="spellEnd"/>
           </w:p>
         </w:tc>
         <w:tc>
@@ -7737,6 +8412,7 @@
                 <w:szCs w:val="28"/>
               </w:rPr>
             </w:pPr>
+            <w:proofErr w:type="spellStart"/>
             <w:r>
               <w:rPr>
                 <w:rFonts w:ascii="Times New Roman" w:hAnsi="Times New Roman" w:cs="Times New Roman"/>
@@ -7746,6 +8422,7 @@
               </w:rPr>
               <w:t>LightGBM</w:t>
             </w:r>
+            <w:proofErr w:type="spellEnd"/>
           </w:p>
         </w:tc>
         <w:tc>
@@ -7802,6 +8479,7 @@
                 <w:szCs w:val="28"/>
               </w:rPr>
             </w:pPr>
+            <w:proofErr w:type="spellStart"/>
             <w:r>
               <w:rPr>
                 <w:rFonts w:ascii="Times New Roman" w:hAnsi="Times New Roman" w:cs="Times New Roman"/>
@@ -7811,6 +8489,7 @@
               </w:rPr>
               <w:t>Streamlit</w:t>
             </w:r>
+            <w:proofErr w:type="spellEnd"/>
           </w:p>
         </w:tc>
         <w:tc>
@@ -7868,6 +8547,7 @@
                 <w:szCs w:val="28"/>
               </w:rPr>
             </w:pPr>
+            <w:proofErr w:type="spellStart"/>
             <w:r>
               <w:rPr>
                 <w:rFonts w:ascii="Times New Roman" w:hAnsi="Times New Roman" w:cs="Times New Roman"/>
@@ -7877,6 +8557,7 @@
               </w:rPr>
               <w:t>Plotly</w:t>
             </w:r>
+            <w:proofErr w:type="spellEnd"/>
           </w:p>
         </w:tc>
         <w:tc>
@@ -7936,6 +8617,7 @@
                 <w:szCs w:val="28"/>
               </w:rPr>
             </w:pPr>
+            <w:proofErr w:type="spellStart"/>
             <w:r>
               <w:rPr>
                 <w:rFonts w:ascii="Times New Roman" w:hAnsi="Times New Roman" w:cs="Times New Roman"/>
@@ -7945,6 +8627,7 @@
               </w:rPr>
               <w:t>Joblib</w:t>
             </w:r>
+            <w:proofErr w:type="spellEnd"/>
           </w:p>
         </w:tc>
         <w:tc>
@@ -8045,7 +8728,47 @@
           <w:sz w:val="28"/>
           <w:szCs w:val="28"/>
         </w:rPr>
-        <w:t>The Smart Traffic Demand Prediction System was successfully developed using machine learning techniques to predict traffic volume based on weather, temporal, and road-related features. After evaluating multiple regression models and applying hyperparameter tuning and ensemble learning, the optimized XGBoost Regressor was selected as the final model due to its superior predictive performance. The Streamlit-based web application provides an interactive platform for traffic analysis and real-time traffic volume prediction, demonstrating the practical application of machine learning in intelligent transportation systems.</w:t>
+        <w:t xml:space="preserve">The Smart Traffic Demand Prediction System was successfully developed using machine learning techniques to predict traffic volume based on weather, temporal, and road-related features. After evaluating multiple regression models and applying hyperparameter tuning and ensemble learning, the optimized </w:t>
+      </w:r>
+      <w:proofErr w:type="spellStart"/>
+      <w:r>
+        <w:rPr>
+          <w:rFonts w:ascii="Times New Roman" w:hAnsi="Times New Roman" w:cs="Times New Roman"/>
+          <w:iCs/>
+          <w:sz w:val="28"/>
+          <w:szCs w:val="28"/>
+        </w:rPr>
+        <w:t>XGBoost</w:t>
+      </w:r>
+      <w:proofErr w:type="spellEnd"/>
+      <w:r>
+        <w:rPr>
+          <w:rFonts w:ascii="Times New Roman" w:hAnsi="Times New Roman" w:cs="Times New Roman"/>
+          <w:iCs/>
+          <w:sz w:val="28"/>
+          <w:szCs w:val="28"/>
+        </w:rPr>
+        <w:t xml:space="preserve"> Regressor was selected as the final model due to its superior predictive performance. The </w:t>
+      </w:r>
+      <w:proofErr w:type="spellStart"/>
+      <w:r>
+        <w:rPr>
+          <w:rFonts w:ascii="Times New Roman" w:hAnsi="Times New Roman" w:cs="Times New Roman"/>
+          <w:iCs/>
+          <w:sz w:val="28"/>
+          <w:szCs w:val="28"/>
+        </w:rPr>
+        <w:t>Streamlit</w:t>
+      </w:r>
+      <w:proofErr w:type="spellEnd"/>
+      <w:r>
+        <w:rPr>
+          <w:rFonts w:ascii="Times New Roman" w:hAnsi="Times New Roman" w:cs="Times New Roman"/>
+          <w:iCs/>
+          <w:sz w:val="28"/>
+          <w:szCs w:val="28"/>
+        </w:rPr>
+        <w:t>-based web application provides an interactive platform for traffic analysis and real-time traffic volume prediction, demonstrating the practical application of machine learning in intelligent transportation systems.</w:t>
       </w:r>
     </w:p>
     <w:p>
@@ -10883,7 +11606,6 @@
   <w:style w:type="character" w:default="1" w:styleId="DefaultParagraphFont">
     <w:name w:val="Default Paragraph Font"/>
     <w:uiPriority w:val="1"/>
-    <w:semiHidden/>
     <w:unhideWhenUsed/>
   </w:style>
   <w:style w:type="table" w:default="1" w:styleId="TableNormal">
@@ -11266,6 +11988,29 @@
     <w:uiPriority w:val="99"/>
     <w:rsid w:val="00244B4D"/>
   </w:style>
+  <w:style w:type="character" w:styleId="Hyperlink">
+    <w:name w:val="Hyperlink"/>
+    <w:basedOn w:val="DefaultParagraphFont"/>
+    <w:uiPriority w:val="99"/>
+    <w:unhideWhenUsed/>
+    <w:rsid w:val="00143FCF"/>
+    <w:rPr>
+      <w:color w:val="467886" w:themeColor="hyperlink"/>
+      <w:u w:val="single"/>
+    </w:rPr>
+  </w:style>
+  <w:style w:type="character" w:styleId="UnresolvedMention">
+    <w:name w:val="Unresolved Mention"/>
+    <w:basedOn w:val="DefaultParagraphFont"/>
+    <w:uiPriority w:val="99"/>
+    <w:semiHidden/>
+    <w:unhideWhenUsed/>
+    <w:rsid w:val="00143FCF"/>
+    <w:rPr>
+      <w:color w:val="605E5C"/>
+      <w:shd w:val="clear" w:color="auto" w:fill="E1DFDD"/>
+    </w:rPr>
+  </w:style>
 </w:styles>
 </file>
 

</xml_diff>

<commit_message>
Updated dashboard screenshot and project report
</commit_message>
<xml_diff>
--- a/reports/Smart_Traffic_Demand_Prediction_Project_Report.docx
+++ b/reports/Smart_Traffic_Demand_Prediction_Project_Report.docx
@@ -51,23 +51,7 @@
           <w:sz w:val="28"/>
           <w:szCs w:val="28"/>
         </w:rPr>
-        <w:t xml:space="preserve">Submitted by: </w:t>
-      </w:r>
-      <w:proofErr w:type="spellStart"/>
-      <w:r>
-        <w:rPr>
-          <w:sz w:val="28"/>
-          <w:szCs w:val="28"/>
-        </w:rPr>
-        <w:t>Kondreddy</w:t>
-      </w:r>
-      <w:proofErr w:type="spellEnd"/>
-      <w:r>
-        <w:rPr>
-          <w:sz w:val="28"/>
-          <w:szCs w:val="28"/>
-        </w:rPr>
-        <w:t xml:space="preserve"> Vikhila</w:t>
+        <w:t>Submitted by: Kondreddy Vikhila</w:t>
       </w:r>
     </w:p>
     <w:p>
@@ -94,10 +78,10 @@
           <w:szCs w:val="28"/>
         </w:rPr>
         <w:drawing>
-          <wp:inline distT="0" distB="0" distL="0" distR="0" wp14:anchorId="1E7106AE" wp14:editId="19467ED5">
-            <wp:extent cx="4175463" cy="3304309"/>
-            <wp:effectExtent l="0" t="0" r="0" b="0"/>
-            <wp:docPr id="360431044" name="Picture 1"/>
+          <wp:inline distT="0" distB="0" distL="0" distR="0" wp14:anchorId="50ED178F" wp14:editId="764DC760">
+            <wp:extent cx="4899660" cy="3763010"/>
+            <wp:effectExtent l="0" t="0" r="0" b="8890"/>
+            <wp:docPr id="755236521" name="Picture 1"/>
             <wp:cNvGraphicFramePr>
               <a:graphicFrameLocks xmlns:a="http://schemas.openxmlformats.org/drawingml/2006/main" noChangeAspect="1"/>
             </wp:cNvGraphicFramePr>
@@ -105,7 +89,7 @@
               <a:graphicData uri="http://schemas.openxmlformats.org/drawingml/2006/picture">
                 <pic:pic xmlns:pic="http://schemas.openxmlformats.org/drawingml/2006/picture">
                   <pic:nvPicPr>
-                    <pic:cNvPr id="360431044" name="Picture 360431044"/>
+                    <pic:cNvPr id="755236521" name="Picture 755236521"/>
                     <pic:cNvPicPr/>
                   </pic:nvPicPr>
                   <pic:blipFill>
@@ -123,7 +107,7 @@
                   <pic:spPr>
                     <a:xfrm>
                       <a:off x="0" y="0"/>
-                      <a:ext cx="4303137" cy="3405345"/>
+                      <a:ext cx="4900125" cy="3763367"/>
                     </a:xfrm>
                     <a:prstGeom prst="rect">
                       <a:avLst/>
@@ -187,7 +171,7 @@
           <w:rPr>
             <w:rStyle w:val="Hyperlink"/>
           </w:rPr>
-          <w:t>https://drive.google.com/file/d/13mKpZaiRv_Hov47p0WJsRUyRaaMF0VI2/view?usp=sharing</w:t>
+          <w:t>https://drive.google.com/file/d/1qdrant2_1cUZ1A_k7MCr20N3OuDJ5T30/view?usp=sharing</w:t>
         </w:r>
       </w:hyperlink>
     </w:p>
@@ -273,70 +257,6 @@
     <w:p>
       <w:pPr>
         <w:rPr>
-          <w:sz w:val="28"/>
-          <w:szCs w:val="28"/>
-        </w:rPr>
-      </w:pPr>
-    </w:p>
-    <w:p>
-      <w:pPr>
-        <w:rPr>
-          <w:sz w:val="28"/>
-          <w:szCs w:val="28"/>
-        </w:rPr>
-      </w:pPr>
-    </w:p>
-    <w:p>
-      <w:pPr>
-        <w:rPr>
-          <w:sz w:val="28"/>
-          <w:szCs w:val="28"/>
-        </w:rPr>
-      </w:pPr>
-    </w:p>
-    <w:p>
-      <w:pPr>
-        <w:rPr>
-          <w:sz w:val="28"/>
-          <w:szCs w:val="28"/>
-        </w:rPr>
-      </w:pPr>
-    </w:p>
-    <w:p>
-      <w:pPr>
-        <w:rPr>
-          <w:sz w:val="28"/>
-          <w:szCs w:val="28"/>
-        </w:rPr>
-      </w:pPr>
-    </w:p>
-    <w:p>
-      <w:pPr>
-        <w:rPr>
-          <w:sz w:val="28"/>
-          <w:szCs w:val="28"/>
-        </w:rPr>
-      </w:pPr>
-    </w:p>
-    <w:p>
-      <w:pPr>
-        <w:rPr>
-          <w:sz w:val="28"/>
-          <w:szCs w:val="28"/>
-        </w:rPr>
-      </w:pPr>
-    </w:p>
-    <w:p>
-      <w:pPr>
-        <w:rPr>
-          <w:sz w:val="28"/>
-          <w:szCs w:val="28"/>
-        </w:rPr>
-      </w:pPr>
-    </w:p>
-    <w:p>
-      <w:pPr>
-        <w:rPr>
           <w:b/>
           <w:bCs/>
           <w:sz w:val="32"/>
@@ -350,6 +270,7 @@
           <w:sz w:val="32"/>
           <w:szCs w:val="32"/>
         </w:rPr>
+        <w:lastRenderedPageBreak/>
         <w:t>1.</w:t>
       </w:r>
       <w:r>
@@ -597,28 +518,73 @@
         <w:jc w:val="both"/>
         <w:rPr>
           <w:rFonts w:ascii="Times New Roman" w:hAnsi="Times New Roman" w:cs="Times New Roman"/>
+          <w:sz w:val="28"/>
+          <w:szCs w:val="28"/>
+        </w:rPr>
+      </w:pPr>
+      <w:r>
+        <w:rPr>
+          <w:rFonts w:asciiTheme="majorHAnsi" w:hAnsiTheme="majorHAnsi" w:cs="Times New Roman"/>
+          <w:b/>
+          <w:bCs/>
+        </w:rPr>
+        <w:t>Dataset Name</w:t>
+      </w:r>
+      <w:r>
+        <w:rPr>
+          <w:rFonts w:asciiTheme="majorHAnsi" w:hAnsiTheme="majorHAnsi" w:cs="Times New Roman"/>
           <w:b/>
           <w:bCs/>
           <w:sz w:val="32"/>
           <w:szCs w:val="32"/>
         </w:rPr>
-      </w:pPr>
-      <w:r>
-        <w:rPr>
-          <w:rFonts w:asciiTheme="majorHAnsi" w:hAnsiTheme="majorHAnsi" w:cs="Times New Roman"/>
-          <w:b/>
-          <w:bCs/>
-        </w:rPr>
-        <w:t>Dataset Name</w:t>
-      </w:r>
-      <w:r>
-        <w:rPr>
-          <w:rFonts w:asciiTheme="majorHAnsi" w:hAnsiTheme="majorHAnsi" w:cs="Times New Roman"/>
+        <w:t xml:space="preserve">: </w:t>
+      </w:r>
+      <w:r>
+        <w:rPr>
+          <w:rFonts w:ascii="Times New Roman" w:hAnsi="Times New Roman" w:cs="Times New Roman"/>
+          <w:sz w:val="28"/>
+          <w:szCs w:val="28"/>
+        </w:rPr>
+        <w:t>Metro Interstate Traffic Volume Dataset</w:t>
+      </w:r>
+    </w:p>
+    <w:p>
+      <w:pPr>
+        <w:spacing w:line="360" w:lineRule="auto"/>
+        <w:jc w:val="both"/>
+        <w:rPr>
+          <w:rFonts w:ascii="Times New Roman" w:hAnsi="Times New Roman" w:cs="Times New Roman"/>
           <w:b/>
           <w:bCs/>
           <w:sz w:val="32"/>
           <w:szCs w:val="32"/>
         </w:rPr>
+      </w:pPr>
+      <w:r>
+        <w:rPr>
+          <w:rFonts w:asciiTheme="majorHAnsi" w:hAnsiTheme="majorHAnsi" w:cs="Times New Roman"/>
+          <w:b/>
+          <w:bCs/>
+        </w:rPr>
+        <w:t>Original Records</w:t>
+      </w:r>
+      <w:r>
+        <w:rPr>
+          <w:rFonts w:ascii="Times New Roman" w:hAnsi="Times New Roman" w:cs="Times New Roman"/>
+          <w:b/>
+          <w:bCs/>
+        </w:rPr>
+        <w:t xml:space="preserve"> </w:t>
+      </w:r>
+      <w:r>
+        <w:rPr>
+          <w:rFonts w:ascii="Times New Roman" w:hAnsi="Times New Roman" w:cs="Times New Roman"/>
+          <w:b/>
+          <w:bCs/>
+          <w:sz w:val="32"/>
+          <w:szCs w:val="32"/>
+        </w:rPr>
         <w:t xml:space="preserve">: </w:t>
       </w:r>
       <w:r>
@@ -627,7 +593,7 @@
           <w:sz w:val="28"/>
           <w:szCs w:val="28"/>
         </w:rPr>
-        <w:t>Metro Interstate Traffic Volume Dataset</w:t>
+        <w:t>48,204</w:t>
       </w:r>
     </w:p>
     <w:p>
@@ -646,8 +612,15 @@
           <w:b/>
           <w:bCs/>
         </w:rPr>
-        <w:lastRenderedPageBreak/>
-        <w:t>Total Records</w:t>
+        <w:t>T</w:t>
+      </w:r>
+      <w:r>
+        <w:rPr>
+          <w:rFonts w:asciiTheme="majorHAnsi" w:hAnsiTheme="majorHAnsi" w:cs="Times New Roman"/>
+          <w:b/>
+          <w:bCs/>
+        </w:rPr>
+        <w:t>raining dataset</w:t>
       </w:r>
       <w:r>
         <w:rPr>
@@ -679,7 +652,7 @@
           <w:sz w:val="28"/>
           <w:szCs w:val="28"/>
         </w:rPr>
-        <w:t>481,204</w:t>
+        <w:t>120000</w:t>
       </w:r>
     </w:p>
     <w:p>
@@ -700,7 +673,7 @@
           <w:b/>
           <w:bCs/>
         </w:rPr>
-        <w:t>Total Features</w:t>
+        <w:t>Total Features After Feature Engineering</w:t>
       </w:r>
       <w:r>
         <w:rPr>
@@ -718,7 +691,7 @@
           <w:sz w:val="28"/>
           <w:szCs w:val="28"/>
         </w:rPr>
-        <w:t>23</w:t>
+        <w:t>45</w:t>
       </w:r>
     </w:p>
     <w:p>
@@ -774,6 +747,7 @@
           <w:b/>
           <w:bCs/>
         </w:rPr>
+        <w:lastRenderedPageBreak/>
         <w:t>Description</w:t>
       </w:r>
       <w:r>
@@ -1061,26 +1035,7 @@
           <w:sz w:val="28"/>
           <w:szCs w:val="28"/>
         </w:rPr>
-        <w:lastRenderedPageBreak/>
-        <w:t xml:space="preserve">Before training the machine learning models, the dataset was </w:t>
-      </w:r>
-      <w:proofErr w:type="spellStart"/>
-      <w:r>
-        <w:rPr>
-          <w:rFonts w:ascii="Times New Roman" w:hAnsi="Times New Roman" w:cs="Times New Roman"/>
-          <w:sz w:val="28"/>
-          <w:szCs w:val="28"/>
-        </w:rPr>
-        <w:t>preprocessed</w:t>
-      </w:r>
-      <w:proofErr w:type="spellEnd"/>
-      <w:r>
-        <w:rPr>
-          <w:rFonts w:ascii="Times New Roman" w:hAnsi="Times New Roman" w:cs="Times New Roman"/>
-          <w:sz w:val="28"/>
-          <w:szCs w:val="28"/>
-        </w:rPr>
-        <w:t xml:space="preserve"> to improve data quality and model performance. Data preprocessing is an essential step that prepares the raw dataset for effective machine learning by handling inconsistencies, transforming features, and selecting relevant information.</w:t>
+        <w:t>Before training the machine learning models, the dataset was preprocessed to improve data quality and model performance. Data preprocessing is an essential step that prepares the raw dataset for effective machine learning by handling inconsistencies, transforming features, and selecting relevant information.</w:t>
       </w:r>
     </w:p>
     <w:p>
@@ -1103,6 +1058,7 @@
           <w:sz w:val="28"/>
           <w:szCs w:val="28"/>
         </w:rPr>
+        <w:lastRenderedPageBreak/>
         <w:t>Preprocessing Steps:</w:t>
       </w:r>
     </w:p>
@@ -1149,25 +1105,7 @@
           <w:sz w:val="28"/>
           <w:szCs w:val="28"/>
         </w:rPr>
-        <w:t xml:space="preserve">Extracted Hour, Day, and Month from the </w:t>
-      </w:r>
-      <w:proofErr w:type="spellStart"/>
-      <w:r>
-        <w:rPr>
-          <w:rFonts w:ascii="Times New Roman" w:hAnsi="Times New Roman" w:cs="Times New Roman"/>
-          <w:sz w:val="28"/>
-          <w:szCs w:val="28"/>
-        </w:rPr>
-        <w:t>date_time</w:t>
-      </w:r>
-      <w:proofErr w:type="spellEnd"/>
-      <w:r>
-        <w:rPr>
-          <w:rFonts w:ascii="Times New Roman" w:hAnsi="Times New Roman" w:cs="Times New Roman"/>
-          <w:sz w:val="28"/>
-          <w:szCs w:val="28"/>
-        </w:rPr>
-        <w:t xml:space="preserve"> feature. </w:t>
+        <w:t xml:space="preserve">Extracted Hour, Day, and Month from the date_time feature. </w:t>
       </w:r>
     </w:p>
     <w:p>
@@ -1213,25 +1151,7 @@
           <w:sz w:val="28"/>
           <w:szCs w:val="28"/>
         </w:rPr>
-        <w:t xml:space="preserve">Created the target variable </w:t>
-      </w:r>
-      <w:proofErr w:type="spellStart"/>
-      <w:r>
-        <w:rPr>
-          <w:rFonts w:ascii="Times New Roman" w:hAnsi="Times New Roman" w:cs="Times New Roman"/>
-          <w:sz w:val="28"/>
-          <w:szCs w:val="28"/>
-        </w:rPr>
-        <w:t>Traffic_Level</w:t>
-      </w:r>
-      <w:proofErr w:type="spellEnd"/>
-      <w:r>
-        <w:rPr>
-          <w:rFonts w:ascii="Times New Roman" w:hAnsi="Times New Roman" w:cs="Times New Roman"/>
-          <w:sz w:val="28"/>
-          <w:szCs w:val="28"/>
-        </w:rPr>
-        <w:t xml:space="preserve"> (Low, Medium, High). </w:t>
+        <w:t xml:space="preserve">Created the target variable Traffic_Level (Low, Medium, High). </w:t>
       </w:r>
     </w:p>
     <w:p>
@@ -1279,47 +1199,30 @@
         </w:rPr>
         <w:t xml:space="preserve">Split the dataset into training and testing sets. </w:t>
       </w:r>
-    </w:p>
-    <w:p>
-      <w:pPr>
-        <w:numPr>
-          <w:ilvl w:val="0"/>
-          <w:numId w:val="3"/>
-        </w:numPr>
+      <w:r>
+        <w:rPr>
+          <w:rFonts w:ascii="Times New Roman" w:hAnsi="Times New Roman" w:cs="Times New Roman"/>
+          <w:sz w:val="28"/>
+          <w:szCs w:val="28"/>
+        </w:rPr>
+        <w:t>Saved the processed dataset.</w:t>
+      </w:r>
+      <w:r>
+        <w:rPr>
+          <w:rFonts w:ascii="Times New Roman" w:hAnsi="Times New Roman" w:cs="Times New Roman"/>
+          <w:sz w:val="28"/>
+          <w:szCs w:val="28"/>
+        </w:rPr>
+        <w:br/>
+        <w:t>Expanded the processed dataset to 120,000 records using sampling with replacement.Saved the final training dataset for machine learning model development.</w:t>
+      </w:r>
+    </w:p>
+    <w:p>
+      <w:pPr>
         <w:spacing w:line="360" w:lineRule="auto"/>
         <w:jc w:val="both"/>
         <w:rPr>
           <w:rFonts w:ascii="Times New Roman" w:hAnsi="Times New Roman" w:cs="Times New Roman"/>
-          <w:sz w:val="28"/>
-          <w:szCs w:val="28"/>
-        </w:rPr>
-      </w:pPr>
-      <w:r>
-        <w:rPr>
-          <w:rFonts w:ascii="Times New Roman" w:hAnsi="Times New Roman" w:cs="Times New Roman"/>
-          <w:sz w:val="28"/>
-          <w:szCs w:val="28"/>
-        </w:rPr>
-        <w:t xml:space="preserve">Saved the processed dataset for machine learning model development. </w:t>
-      </w:r>
-    </w:p>
-    <w:p>
-      <w:pPr>
-        <w:spacing w:line="360" w:lineRule="auto"/>
-        <w:jc w:val="both"/>
-        <w:rPr>
-          <w:rFonts w:ascii="Times New Roman" w:hAnsi="Times New Roman" w:cs="Times New Roman"/>
-          <w:sz w:val="28"/>
-          <w:szCs w:val="28"/>
-        </w:rPr>
-      </w:pPr>
-    </w:p>
-    <w:p>
-      <w:pPr>
-        <w:spacing w:line="360" w:lineRule="auto"/>
-        <w:jc w:val="both"/>
-        <w:rPr>
-          <w:rFonts w:ascii="Times New Roman" w:hAnsi="Times New Roman" w:cs="Times New Roman"/>
           <w:b/>
           <w:bCs/>
           <w:sz w:val="28"/>
@@ -1335,7 +1238,6 @@
           <w:sz w:val="28"/>
           <w:szCs w:val="28"/>
         </w:rPr>
-        <w:lastRenderedPageBreak/>
         <w:drawing>
           <wp:inline distT="0" distB="0" distL="0" distR="0" wp14:anchorId="16BF7F1C" wp14:editId="4D8AB537">
             <wp:extent cx="6314508" cy="4212000"/>
@@ -1535,25 +1437,7 @@
           <w:sz w:val="28"/>
           <w:szCs w:val="28"/>
         </w:rPr>
-        <w:t xml:space="preserve">Exploratory Data Analysis (EDA) was performed to understand the characteristics of the traffic dataset before developing the machine learning models. Different visualizations were used to </w:t>
-      </w:r>
-      <w:proofErr w:type="spellStart"/>
-      <w:r>
-        <w:rPr>
-          <w:rFonts w:ascii="Times New Roman" w:hAnsi="Times New Roman" w:cs="Times New Roman"/>
-          <w:sz w:val="28"/>
-          <w:szCs w:val="28"/>
-        </w:rPr>
-        <w:t>analyze</w:t>
-      </w:r>
-      <w:proofErr w:type="spellEnd"/>
-      <w:r>
-        <w:rPr>
-          <w:rFonts w:ascii="Times New Roman" w:hAnsi="Times New Roman" w:cs="Times New Roman"/>
-          <w:sz w:val="28"/>
-          <w:szCs w:val="28"/>
-        </w:rPr>
-        <w:t xml:space="preserve"> traffic patterns, weather conditions, road types, temporal trends, and relationships among features. The insights obtained from EDA helped in selecting relevant features for traffic volume prediction.</w:t>
+        <w:t>Exploratory Data Analysis (EDA) was performed to understand the characteristics of the traffic dataset before developing the machine learning models. Different visualizations were used to analyze traffic patterns, weather conditions, road types, temporal trends, and relationships among features. The insights obtained from EDA helped in selecting relevant features for traffic volume prediction.</w:t>
       </w:r>
     </w:p>
     <w:p>
@@ -3016,7 +2900,6 @@
                 <w:szCs w:val="28"/>
               </w:rPr>
             </w:pPr>
-            <w:proofErr w:type="spellStart"/>
             <w:r>
               <w:rPr>
                 <w:rFonts w:ascii="Times New Roman" w:hAnsi="Times New Roman" w:cs="Times New Roman"/>
@@ -3031,16 +2914,7 @@
                 <w:sz w:val="28"/>
                 <w:szCs w:val="28"/>
               </w:rPr>
-              <w:t>Boost</w:t>
-            </w:r>
-            <w:proofErr w:type="spellEnd"/>
-            <w:r>
-              <w:rPr>
-                <w:rFonts w:ascii="Times New Roman" w:hAnsi="Times New Roman" w:cs="Times New Roman"/>
-                <w:sz w:val="28"/>
-                <w:szCs w:val="28"/>
-              </w:rPr>
-              <w:t xml:space="preserve"> Regressor</w:t>
+              <w:t>Boost Regressor</w:t>
             </w:r>
           </w:p>
         </w:tc>
@@ -3098,7 +2972,6 @@
                 <w:szCs w:val="28"/>
               </w:rPr>
             </w:pPr>
-            <w:proofErr w:type="spellStart"/>
             <w:r>
               <w:rPr>
                 <w:rFonts w:ascii="Times New Roman" w:hAnsi="Times New Roman" w:cs="Times New Roman"/>
@@ -3115,7 +2988,6 @@
               </w:rPr>
               <w:t>GBM</w:t>
             </w:r>
-            <w:proofErr w:type="spellEnd"/>
             <w:r>
               <w:rPr>
                 <w:rFonts w:ascii="Times New Roman" w:hAnsi="Times New Roman" w:cs="Times New Roman"/>
@@ -3169,27 +3041,33 @@
           <w:szCs w:val="28"/>
         </w:rPr>
       </w:pPr>
+      <w:r>
+        <w:rPr>
+          <w:rFonts w:asciiTheme="majorHAnsi" w:hAnsiTheme="majorHAnsi" w:cs="Times New Roman"/>
+          <w:b/>
+          <w:bCs/>
+          <w:sz w:val="28"/>
+          <w:szCs w:val="28"/>
+        </w:rPr>
+        <w:t>Train-Test Split</w:t>
+      </w:r>
     </w:p>
     <w:p>
       <w:pPr>
         <w:spacing w:line="360" w:lineRule="auto"/>
         <w:rPr>
-          <w:rFonts w:asciiTheme="majorHAnsi" w:hAnsiTheme="majorHAnsi" w:cs="Times New Roman"/>
-          <w:b/>
-          <w:bCs/>
-          <w:sz w:val="28"/>
-          <w:szCs w:val="28"/>
-        </w:rPr>
-      </w:pPr>
-      <w:r>
-        <w:rPr>
-          <w:rFonts w:asciiTheme="majorHAnsi" w:hAnsiTheme="majorHAnsi" w:cs="Times New Roman"/>
-          <w:b/>
-          <w:bCs/>
-          <w:sz w:val="28"/>
-          <w:szCs w:val="28"/>
-        </w:rPr>
-        <w:t>Train-Test Split</w:t>
+          <w:rFonts w:ascii="Times New Roman" w:hAnsi="Times New Roman" w:cs="Times New Roman"/>
+          <w:sz w:val="28"/>
+          <w:szCs w:val="28"/>
+        </w:rPr>
+      </w:pPr>
+      <w:r>
+        <w:rPr>
+          <w:rFonts w:ascii="Times New Roman" w:hAnsi="Times New Roman" w:cs="Times New Roman"/>
+          <w:sz w:val="28"/>
+          <w:szCs w:val="28"/>
+        </w:rPr>
+        <w:t>The dataset was divided into training and testing sets using an 80:20 ratio. The training dataset was used to train the regression models, while the testing dataset was used to evaluate their predictive performance.</w:t>
       </w:r>
     </w:p>
     <w:p>
@@ -3204,21 +3082,99 @@
       <w:r>
         <w:rPr>
           <w:rFonts w:ascii="Times New Roman" w:hAnsi="Times New Roman" w:cs="Times New Roman"/>
-          <w:sz w:val="28"/>
-          <w:szCs w:val="28"/>
-        </w:rPr>
-        <w:t>The dataset was divided into training and testing sets using an 80:20 ratio. The training dataset was used to train the regression models, while the testing dataset was used to evaluate their predictive performance.</w:t>
-      </w:r>
-    </w:p>
-    <w:p>
-      <w:pPr>
-        <w:spacing w:line="360" w:lineRule="auto"/>
-        <w:rPr>
-          <w:rFonts w:ascii="Times New Roman" w:hAnsi="Times New Roman" w:cs="Times New Roman"/>
-          <w:sz w:val="28"/>
-          <w:szCs w:val="28"/>
-        </w:rPr>
-      </w:pPr>
+          <w:b/>
+          <w:bCs/>
+        </w:rPr>
+        <w:t>Final Dataset Used for Training</w:t>
+      </w:r>
+      <w:r>
+        <w:rPr>
+          <w:rFonts w:ascii="Times New Roman" w:hAnsi="Times New Roman" w:cs="Times New Roman"/>
+          <w:sz w:val="28"/>
+          <w:szCs w:val="28"/>
+        </w:rPr>
+        <w:br/>
+      </w:r>
+      <w:r>
+        <w:rPr>
+          <w:rFonts w:ascii="Times New Roman" w:hAnsi="Times New Roman" w:cs="Times New Roman"/>
+          <w:b/>
+          <w:bCs/>
+        </w:rPr>
+        <w:t>Training Dataset Size</w:t>
+      </w:r>
+      <w:r>
+        <w:rPr>
+          <w:rFonts w:ascii="Times New Roman" w:hAnsi="Times New Roman" w:cs="Times New Roman"/>
+          <w:sz w:val="28"/>
+          <w:szCs w:val="28"/>
+        </w:rPr>
+        <w:t xml:space="preserve"> : 120,000 Records</w:t>
+      </w:r>
+      <w:r>
+        <w:rPr>
+          <w:rFonts w:ascii="Times New Roman" w:hAnsi="Times New Roman" w:cs="Times New Roman"/>
+          <w:sz w:val="28"/>
+          <w:szCs w:val="28"/>
+        </w:rPr>
+        <w:br/>
+      </w:r>
+      <w:r>
+        <w:rPr>
+          <w:rFonts w:ascii="Times New Roman" w:hAnsi="Times New Roman" w:cs="Times New Roman"/>
+          <w:b/>
+          <w:bCs/>
+        </w:rPr>
+        <w:t>Testing Ratio</w:t>
+      </w:r>
+      <w:r>
+        <w:rPr>
+          <w:rFonts w:ascii="Times New Roman" w:hAnsi="Times New Roman" w:cs="Times New Roman"/>
+          <w:sz w:val="28"/>
+          <w:szCs w:val="28"/>
+        </w:rPr>
+        <w:t xml:space="preserve"> : 80 : 20</w:t>
+      </w:r>
+      <w:r>
+        <w:rPr>
+          <w:rFonts w:ascii="Times New Roman" w:hAnsi="Times New Roman" w:cs="Times New Roman"/>
+          <w:sz w:val="28"/>
+          <w:szCs w:val="28"/>
+        </w:rPr>
+        <w:t>,</w:t>
+      </w:r>
+      <w:r>
+        <w:rPr>
+          <w:rFonts w:ascii="Times New Roman" w:hAnsi="Times New Roman" w:cs="Times New Roman"/>
+          <w:sz w:val="28"/>
+          <w:szCs w:val="28"/>
+        </w:rPr>
+        <w:t xml:space="preserve"> </w:t>
+      </w:r>
+      <w:r>
+        <w:rPr>
+          <w:rFonts w:ascii="Times New Roman" w:hAnsi="Times New Roman" w:cs="Times New Roman"/>
+          <w:b/>
+          <w:bCs/>
+        </w:rPr>
+        <w:t>Total Input Features</w:t>
+      </w:r>
+      <w:r>
+        <w:rPr>
+          <w:rFonts w:ascii="Times New Roman" w:hAnsi="Times New Roman" w:cs="Times New Roman"/>
+          <w:sz w:val="28"/>
+          <w:szCs w:val="28"/>
+        </w:rPr>
+        <w:t xml:space="preserve"> : 45</w:t>
+      </w:r>
+      <w:r>
+        <w:rPr>
+          <w:rFonts w:ascii="Times New Roman" w:hAnsi="Times New Roman" w:cs="Times New Roman"/>
+          <w:sz w:val="28"/>
+          <w:szCs w:val="28"/>
+        </w:rPr>
+        <w:br/>
+      </w:r>
       <w:r>
         <w:rPr>
           <w:rFonts w:ascii="Times New Roman" w:hAnsi="Times New Roman" w:cs="Times New Roman"/>
@@ -3227,8 +3183,8 @@
           <w:szCs w:val="28"/>
         </w:rPr>
         <w:drawing>
-          <wp:inline distT="0" distB="0" distL="0" distR="0" wp14:anchorId="0FFEC413" wp14:editId="42FB6ABA">
-            <wp:extent cx="2916382" cy="2275020"/>
+          <wp:inline distT="0" distB="0" distL="0" distR="0" wp14:anchorId="0FFEC413" wp14:editId="7D7AC41C">
+            <wp:extent cx="2179320" cy="1700050"/>
             <wp:effectExtent l="0" t="0" r="0" b="0"/>
             <wp:docPr id="529182967" name="Picture 3"/>
             <wp:cNvGraphicFramePr>
@@ -3256,7 +3212,7 @@
                   <pic:spPr>
                     <a:xfrm>
                       <a:off x="0" y="0"/>
-                      <a:ext cx="2928857" cy="2284752"/>
+                      <a:ext cx="2189454" cy="1707956"/>
                     </a:xfrm>
                     <a:prstGeom prst="rect">
                       <a:avLst/>
@@ -3924,23 +3880,13 @@
                 <w:szCs w:val="28"/>
               </w:rPr>
             </w:pPr>
-            <w:proofErr w:type="spellStart"/>
             <w:r>
               <w:rPr>
                 <w:rFonts w:ascii="Times New Roman" w:hAnsi="Times New Roman" w:cs="Times New Roman"/>
                 <w:sz w:val="28"/>
                 <w:szCs w:val="28"/>
               </w:rPr>
-              <w:t>XGBoost</w:t>
-            </w:r>
-            <w:proofErr w:type="spellEnd"/>
-            <w:r>
-              <w:rPr>
-                <w:rFonts w:ascii="Times New Roman" w:hAnsi="Times New Roman" w:cs="Times New Roman"/>
-                <w:sz w:val="28"/>
-                <w:szCs w:val="28"/>
-              </w:rPr>
-              <w:t xml:space="preserve"> Regressor</w:t>
+              <w:t>XGBoost Regressor</w:t>
             </w:r>
           </w:p>
         </w:tc>
@@ -4075,23 +4021,13 @@
                 <w:szCs w:val="28"/>
               </w:rPr>
             </w:pPr>
-            <w:proofErr w:type="spellStart"/>
             <w:r>
               <w:rPr>
                 <w:rFonts w:ascii="Times New Roman" w:hAnsi="Times New Roman" w:cs="Times New Roman"/>
                 <w:sz w:val="28"/>
                 <w:szCs w:val="28"/>
               </w:rPr>
-              <w:t>LightGBM</w:t>
-            </w:r>
-            <w:proofErr w:type="spellEnd"/>
-            <w:r>
-              <w:rPr>
-                <w:rFonts w:ascii="Times New Roman" w:hAnsi="Times New Roman" w:cs="Times New Roman"/>
-                <w:sz w:val="28"/>
-                <w:szCs w:val="28"/>
-              </w:rPr>
-              <w:t xml:space="preserve"> Regressor</w:t>
+              <w:t>LightGBM Regressor</w:t>
             </w:r>
           </w:p>
         </w:tc>
@@ -4354,41 +4290,13 @@
           <w:szCs w:val="28"/>
         </w:rPr>
       </w:pPr>
-      <w:proofErr w:type="spellStart"/>
-      <w:r>
-        <w:rPr>
-          <w:rFonts w:ascii="Times New Roman" w:hAnsi="Times New Roman" w:cs="Times New Roman"/>
-          <w:sz w:val="28"/>
-          <w:szCs w:val="28"/>
-        </w:rPr>
-        <w:t>GridSearchCV</w:t>
-      </w:r>
-      <w:proofErr w:type="spellEnd"/>
-      <w:r>
-        <w:rPr>
-          <w:rFonts w:ascii="Times New Roman" w:hAnsi="Times New Roman" w:cs="Times New Roman"/>
-          <w:sz w:val="28"/>
-          <w:szCs w:val="28"/>
-        </w:rPr>
-        <w:t xml:space="preserve"> was used to search for the best hyperparameter combinations using cross-validation. The optimized parameters obtained from </w:t>
-      </w:r>
-      <w:proofErr w:type="spellStart"/>
-      <w:r>
-        <w:rPr>
-          <w:rFonts w:ascii="Times New Roman" w:hAnsi="Times New Roman" w:cs="Times New Roman"/>
-          <w:sz w:val="28"/>
-          <w:szCs w:val="28"/>
-        </w:rPr>
-        <w:t>GridSearchCV</w:t>
-      </w:r>
-      <w:proofErr w:type="spellEnd"/>
-      <w:r>
-        <w:rPr>
-          <w:rFonts w:ascii="Times New Roman" w:hAnsi="Times New Roman" w:cs="Times New Roman"/>
-          <w:sz w:val="28"/>
-          <w:szCs w:val="28"/>
-        </w:rPr>
-        <w:t xml:space="preserve"> were then used to retrain each regression model.</w:t>
+      <w:r>
+        <w:rPr>
+          <w:rFonts w:ascii="Times New Roman" w:hAnsi="Times New Roman" w:cs="Times New Roman"/>
+          <w:sz w:val="28"/>
+          <w:szCs w:val="28"/>
+        </w:rPr>
+        <w:t>GridSearchCV was used to search for the best hyperparameter combinations using cross-validation. The optimized parameters obtained from GridSearchCV were then used to retrain each regression model.</w:t>
       </w:r>
     </w:p>
     <w:p>
@@ -4771,18 +4679,8 @@
                 <w:sz w:val="28"/>
                 <w:szCs w:val="28"/>
               </w:rPr>
-              <w:t xml:space="preserve">Optimized </w:t>
+              <w:t>Optimized XGBoost</w:t>
             </w:r>
-            <w:proofErr w:type="spellStart"/>
-            <w:r>
-              <w:rPr>
-                <w:rFonts w:ascii="Times New Roman" w:hAnsi="Times New Roman" w:cs="Times New Roman"/>
-                <w:sz w:val="28"/>
-                <w:szCs w:val="28"/>
-              </w:rPr>
-              <w:t>XGBoost</w:t>
-            </w:r>
-            <w:proofErr w:type="spellEnd"/>
           </w:p>
         </w:tc>
         <w:tc>
@@ -4928,18 +4826,8 @@
                 <w:sz w:val="28"/>
                 <w:szCs w:val="28"/>
               </w:rPr>
-              <w:t xml:space="preserve">Optimized </w:t>
+              <w:t>Optimized LightGBM</w:t>
             </w:r>
-            <w:proofErr w:type="spellStart"/>
-            <w:r>
-              <w:rPr>
-                <w:rFonts w:ascii="Times New Roman" w:hAnsi="Times New Roman" w:cs="Times New Roman"/>
-                <w:sz w:val="28"/>
-                <w:szCs w:val="28"/>
-              </w:rPr>
-              <w:t>LightGBM</w:t>
-            </w:r>
-            <w:proofErr w:type="spellEnd"/>
           </w:p>
         </w:tc>
         <w:tc>
@@ -5100,49 +4988,7 @@
         <w:rPr>
           <w:rFonts w:ascii="Times New Roman" w:hAnsi="Times New Roman" w:cs="Times New Roman"/>
         </w:rPr>
-        <w:t xml:space="preserve">Hyperparameter tuning improved the performance of the </w:t>
-      </w:r>
-      <w:proofErr w:type="spellStart"/>
-      <w:r>
-        <w:rPr>
-          <w:rFonts w:ascii="Times New Roman" w:hAnsi="Times New Roman" w:cs="Times New Roman"/>
-        </w:rPr>
-        <w:t>XGBoost</w:t>
-      </w:r>
-      <w:proofErr w:type="spellEnd"/>
-      <w:r>
-        <w:rPr>
-          <w:rFonts w:ascii="Times New Roman" w:hAnsi="Times New Roman" w:cs="Times New Roman"/>
-        </w:rPr>
-        <w:t xml:space="preserve"> and </w:t>
-      </w:r>
-      <w:proofErr w:type="spellStart"/>
-      <w:r>
-        <w:rPr>
-          <w:rFonts w:ascii="Times New Roman" w:hAnsi="Times New Roman" w:cs="Times New Roman"/>
-        </w:rPr>
-        <w:t>LightGBM</w:t>
-      </w:r>
-      <w:proofErr w:type="spellEnd"/>
-      <w:r>
-        <w:rPr>
-          <w:rFonts w:ascii="Times New Roman" w:hAnsi="Times New Roman" w:cs="Times New Roman"/>
-        </w:rPr>
-        <w:t xml:space="preserve"> models. Among the optimized models, </w:t>
-      </w:r>
-      <w:proofErr w:type="spellStart"/>
-      <w:r>
-        <w:rPr>
-          <w:rFonts w:ascii="Times New Roman" w:hAnsi="Times New Roman" w:cs="Times New Roman"/>
-        </w:rPr>
-        <w:t>XGBoost</w:t>
-      </w:r>
-      <w:proofErr w:type="spellEnd"/>
-      <w:r>
-        <w:rPr>
-          <w:rFonts w:ascii="Times New Roman" w:hAnsi="Times New Roman" w:cs="Times New Roman"/>
-        </w:rPr>
-        <w:t xml:space="preserve"> achieved the lowest prediction errors and the highest R² score, making it the best-performing model after optimization.</w:t>
+        <w:t>Hyperparameter tuning improved the performance of the XGBoost and LightGBM models. Among the optimized models, XGBoost achieved the lowest prediction errors and the highest R² score, making it the best-performing model after optimization.</w:t>
       </w:r>
     </w:p>
     <w:p>
@@ -5275,43 +5121,7 @@
           <w:sz w:val="28"/>
           <w:szCs w:val="28"/>
         </w:rPr>
-        <w:t xml:space="preserve">A weighted ensemble technique was used by assigning different weights to the predictions generated by the optimized Random Forest, </w:t>
-      </w:r>
-      <w:proofErr w:type="spellStart"/>
-      <w:r>
-        <w:rPr>
-          <w:rFonts w:ascii="Times New Roman" w:hAnsi="Times New Roman" w:cs="Times New Roman"/>
-          <w:sz w:val="28"/>
-          <w:szCs w:val="28"/>
-        </w:rPr>
-        <w:t>XGBoost</w:t>
-      </w:r>
-      <w:proofErr w:type="spellEnd"/>
-      <w:r>
-        <w:rPr>
-          <w:rFonts w:ascii="Times New Roman" w:hAnsi="Times New Roman" w:cs="Times New Roman"/>
-          <w:sz w:val="28"/>
-          <w:szCs w:val="28"/>
-        </w:rPr>
-        <w:t xml:space="preserve">, and </w:t>
-      </w:r>
-      <w:proofErr w:type="spellStart"/>
-      <w:r>
-        <w:rPr>
-          <w:rFonts w:ascii="Times New Roman" w:hAnsi="Times New Roman" w:cs="Times New Roman"/>
-          <w:sz w:val="28"/>
-          <w:szCs w:val="28"/>
-        </w:rPr>
-        <w:t>LightGBM</w:t>
-      </w:r>
-      <w:proofErr w:type="spellEnd"/>
-      <w:r>
-        <w:rPr>
-          <w:rFonts w:ascii="Times New Roman" w:hAnsi="Times New Roman" w:cs="Times New Roman"/>
-          <w:sz w:val="28"/>
-          <w:szCs w:val="28"/>
-        </w:rPr>
-        <w:t xml:space="preserve"> models. The final prediction was calculated as the weighted average of the individual model predictions.</w:t>
+        <w:t>A weighted ensemble technique was used by assigning different weights to the predictions generated by the optimized Random Forest, XGBoost, and LightGBM models. The final prediction was calculated as the weighted average of the individual model predictions.</w:t>
       </w:r>
     </w:p>
     <w:p>
@@ -5900,7 +5710,6 @@
                 <w:szCs w:val="28"/>
               </w:rPr>
             </w:pPr>
-            <w:proofErr w:type="spellStart"/>
             <w:r>
               <w:rPr>
                 <w:rFonts w:ascii="Times New Roman" w:hAnsi="Times New Roman" w:cs="Times New Roman"/>
@@ -5908,17 +5717,7 @@
                 <w:sz w:val="28"/>
                 <w:szCs w:val="28"/>
               </w:rPr>
-              <w:t>XGBoost</w:t>
-            </w:r>
-            <w:proofErr w:type="spellEnd"/>
-            <w:r>
-              <w:rPr>
-                <w:rFonts w:ascii="Times New Roman" w:hAnsi="Times New Roman" w:cs="Times New Roman"/>
-                <w:iCs/>
-                <w:sz w:val="28"/>
-                <w:szCs w:val="28"/>
-              </w:rPr>
-              <w:t xml:space="preserve"> (Optimized)</w:t>
+              <w:t>XGBoost (Optimized)</w:t>
             </w:r>
           </w:p>
         </w:tc>
@@ -6062,7 +5861,6 @@
                 <w:szCs w:val="28"/>
               </w:rPr>
             </w:pPr>
-            <w:proofErr w:type="spellStart"/>
             <w:r>
               <w:rPr>
                 <w:rFonts w:ascii="Times New Roman" w:hAnsi="Times New Roman" w:cs="Times New Roman"/>
@@ -6070,17 +5868,7 @@
                 <w:sz w:val="28"/>
                 <w:szCs w:val="28"/>
               </w:rPr>
-              <w:t>LightGBM</w:t>
-            </w:r>
-            <w:proofErr w:type="spellEnd"/>
-            <w:r>
-              <w:rPr>
-                <w:rFonts w:ascii="Times New Roman" w:hAnsi="Times New Roman" w:cs="Times New Roman"/>
-                <w:iCs/>
-                <w:sz w:val="28"/>
-                <w:szCs w:val="28"/>
-              </w:rPr>
-              <w:t xml:space="preserve"> (Optimized)</w:t>
+              <w:t>LightGBM (Optimized)</w:t>
             </w:r>
           </w:p>
         </w:tc>
@@ -6475,39 +6263,7 @@
           <w:rFonts w:ascii="Times New Roman" w:hAnsi="Times New Roman" w:cs="Times New Roman"/>
           <w:iCs/>
         </w:rPr>
-        <w:t xml:space="preserve">The weighted ensemble model achieved highly accurate predictions by combining multiple optimized models. However, the optimized </w:t>
-      </w:r>
-      <w:proofErr w:type="spellStart"/>
-      <w:r>
-        <w:rPr>
-          <w:rFonts w:ascii="Times New Roman" w:hAnsi="Times New Roman" w:cs="Times New Roman"/>
-          <w:iCs/>
-        </w:rPr>
-        <w:t>XGBoost</w:t>
-      </w:r>
-      <w:proofErr w:type="spellEnd"/>
-      <w:r>
-        <w:rPr>
-          <w:rFonts w:ascii="Times New Roman" w:hAnsi="Times New Roman" w:cs="Times New Roman"/>
-          <w:iCs/>
-        </w:rPr>
-        <w:t xml:space="preserve"> model still produced the lowest prediction error and the highest R² score. Therefore, </w:t>
-      </w:r>
-      <w:proofErr w:type="spellStart"/>
-      <w:r>
-        <w:rPr>
-          <w:rFonts w:ascii="Times New Roman" w:hAnsi="Times New Roman" w:cs="Times New Roman"/>
-          <w:iCs/>
-        </w:rPr>
-        <w:t>XGBoost</w:t>
-      </w:r>
-      <w:proofErr w:type="spellEnd"/>
-      <w:r>
-        <w:rPr>
-          <w:rFonts w:ascii="Times New Roman" w:hAnsi="Times New Roman" w:cs="Times New Roman"/>
-          <w:iCs/>
-        </w:rPr>
-        <w:t xml:space="preserve"> was selected as the final deployment model.</w:t>
+        <w:t>The weighted ensemble model achieved highly accurate predictions by combining multiple optimized models. However, the optimized XGBoost model still produced the lowest prediction error and the highest R² score. Therefore, XGBoost was selected as the final deployment model.</w:t>
       </w:r>
     </w:p>
     <w:p>
@@ -6595,9 +6351,8 @@
           <w:sz w:val="28"/>
           <w:szCs w:val="28"/>
         </w:rPr>
-        <w:t xml:space="preserve">Based on the evaluation results obtained from the baseline models, hyperparameter tuning, and ensemble learning, the Optimized </w:t>
-      </w:r>
-      <w:proofErr w:type="spellStart"/>
+        <w:t>Based on the evaluation results obtained from the baseline models, hyperparameter tuning, and ensemble learning, the Optimized XGBoost Regressor was selected as the final model for de</w:t>
+      </w:r>
       <w:r>
         <w:rPr>
           <w:rFonts w:ascii="Times New Roman" w:hAnsi="Times New Roman" w:cs="Times New Roman"/>
@@ -6605,63 +6360,31 @@
           <w:sz w:val="28"/>
           <w:szCs w:val="28"/>
         </w:rPr>
-        <w:t>XGBoost</w:t>
-      </w:r>
-      <w:proofErr w:type="spellEnd"/>
-      <w:r>
-        <w:rPr>
-          <w:rFonts w:ascii="Times New Roman" w:hAnsi="Times New Roman" w:cs="Times New Roman"/>
+        <w:t>ployment.</w:t>
+      </w:r>
+    </w:p>
+    <w:p>
+      <w:pPr>
+        <w:rPr>
+          <w:rFonts w:asciiTheme="majorHAnsi" w:hAnsiTheme="majorHAnsi" w:cs="Times New Roman"/>
+          <w:b/>
+          <w:bCs/>
           <w:iCs/>
           <w:sz w:val="28"/>
           <w:szCs w:val="28"/>
         </w:rPr>
-        <w:t xml:space="preserve"> Regressor was selected as the final model for de</w:t>
-      </w:r>
-      <w:r>
-        <w:rPr>
-          <w:rFonts w:ascii="Times New Roman" w:hAnsi="Times New Roman" w:cs="Times New Roman"/>
+      </w:pPr>
+      <w:r>
+        <w:rPr>
+          <w:rFonts w:asciiTheme="majorHAnsi" w:hAnsiTheme="majorHAnsi" w:cs="Times New Roman"/>
+          <w:b/>
+          <w:bCs/>
           <w:iCs/>
           <w:sz w:val="28"/>
           <w:szCs w:val="28"/>
         </w:rPr>
-        <w:t>ployment.</w:t>
-      </w:r>
-    </w:p>
-    <w:p>
-      <w:pPr>
-        <w:rPr>
-          <w:rFonts w:asciiTheme="majorHAnsi" w:hAnsiTheme="majorHAnsi" w:cs="Times New Roman"/>
-          <w:b/>
-          <w:bCs/>
-          <w:iCs/>
-          <w:sz w:val="28"/>
-          <w:szCs w:val="28"/>
-        </w:rPr>
-      </w:pPr>
-      <w:r>
-        <w:rPr>
-          <w:rFonts w:asciiTheme="majorHAnsi" w:hAnsiTheme="majorHAnsi" w:cs="Times New Roman"/>
-          <w:b/>
-          <w:bCs/>
-          <w:iCs/>
-          <w:sz w:val="28"/>
-          <w:szCs w:val="28"/>
-        </w:rPr>
-        <w:t xml:space="preserve">Reasons for Selecting </w:t>
-      </w:r>
-      <w:proofErr w:type="spellStart"/>
-      <w:r>
-        <w:rPr>
-          <w:rFonts w:asciiTheme="majorHAnsi" w:hAnsiTheme="majorHAnsi" w:cs="Times New Roman"/>
-          <w:b/>
-          <w:bCs/>
-          <w:iCs/>
-          <w:sz w:val="28"/>
-          <w:szCs w:val="28"/>
-        </w:rPr>
-        <w:t>XGBoost</w:t>
-      </w:r>
-      <w:proofErr w:type="spellEnd"/>
+        <w:t>Reasons for Selecting XGBoost</w:t>
+      </w:r>
     </w:p>
     <w:p>
       <w:pPr>
@@ -7267,47 +6990,7 @@
           <w:sz w:val="28"/>
           <w:szCs w:val="28"/>
         </w:rPr>
-        <w:t xml:space="preserve">A user-friendly web application was developed using </w:t>
-      </w:r>
-      <w:proofErr w:type="spellStart"/>
-      <w:r>
-        <w:rPr>
-          <w:rFonts w:ascii="Times New Roman" w:hAnsi="Times New Roman" w:cs="Times New Roman"/>
-          <w:iCs/>
-          <w:sz w:val="28"/>
-          <w:szCs w:val="28"/>
-        </w:rPr>
-        <w:t>Streamlit</w:t>
-      </w:r>
-      <w:proofErr w:type="spellEnd"/>
-      <w:r>
-        <w:rPr>
-          <w:rFonts w:ascii="Times New Roman" w:hAnsi="Times New Roman" w:cs="Times New Roman"/>
-          <w:iCs/>
-          <w:sz w:val="28"/>
-          <w:szCs w:val="28"/>
-        </w:rPr>
-        <w:t xml:space="preserve"> to demonstrate the traffic prediction system. The application allows users to </w:t>
-      </w:r>
-      <w:proofErr w:type="spellStart"/>
-      <w:r>
-        <w:rPr>
-          <w:rFonts w:ascii="Times New Roman" w:hAnsi="Times New Roman" w:cs="Times New Roman"/>
-          <w:iCs/>
-          <w:sz w:val="28"/>
-          <w:szCs w:val="28"/>
-        </w:rPr>
-        <w:t>analyze</w:t>
-      </w:r>
-      <w:proofErr w:type="spellEnd"/>
-      <w:r>
-        <w:rPr>
-          <w:rFonts w:ascii="Times New Roman" w:hAnsi="Times New Roman" w:cs="Times New Roman"/>
-          <w:iCs/>
-          <w:sz w:val="28"/>
-          <w:szCs w:val="28"/>
-        </w:rPr>
-        <w:t xml:space="preserve"> traffic patterns, predict traffic volume, and visualize important traffic insights through an interactive interface.</w:t>
+        <w:t>A user-friendly web application was developed using Streamlit to demonstrate the traffic prediction system. The application allows users to analyze traffic patterns, predict traffic volume, and visualize important traffic insights through an interactive interface.</w:t>
       </w:r>
     </w:p>
     <w:p>
@@ -7427,10 +7110,10 @@
           <w:szCs w:val="28"/>
         </w:rPr>
         <w:drawing>
-          <wp:inline distT="0" distB="0" distL="0" distR="0" wp14:anchorId="20FA1049" wp14:editId="40109662">
-            <wp:extent cx="5534891" cy="2342515"/>
-            <wp:effectExtent l="0" t="0" r="8890" b="635"/>
-            <wp:docPr id="906354523" name="Picture 4"/>
+          <wp:inline distT="0" distB="0" distL="0" distR="0" wp14:anchorId="7E301C01" wp14:editId="0989B4CA">
+            <wp:extent cx="5052060" cy="2442210"/>
+            <wp:effectExtent l="0" t="0" r="0" b="0"/>
+            <wp:docPr id="1229010613" name="Picture 2"/>
             <wp:cNvGraphicFramePr>
               <a:graphicFrameLocks xmlns:a="http://schemas.openxmlformats.org/drawingml/2006/main" noChangeAspect="1"/>
             </wp:cNvGraphicFramePr>
@@ -7438,7 +7121,7 @@
               <a:graphicData uri="http://schemas.openxmlformats.org/drawingml/2006/picture">
                 <pic:pic xmlns:pic="http://schemas.openxmlformats.org/drawingml/2006/picture">
                   <pic:nvPicPr>
-                    <pic:cNvPr id="906354523" name="Picture 906354523"/>
+                    <pic:cNvPr id="1229010613" name="Picture 1229010613"/>
                     <pic:cNvPicPr/>
                   </pic:nvPicPr>
                   <pic:blipFill>
@@ -7456,7 +7139,7 @@
                   <pic:spPr>
                     <a:xfrm>
                       <a:off x="0" y="0"/>
-                      <a:ext cx="5564084" cy="2354870"/>
+                      <a:ext cx="5056330" cy="2444274"/>
                     </a:xfrm>
                     <a:prstGeom prst="rect">
                       <a:avLst/>
@@ -7540,27 +7223,7 @@
           <w:sz w:val="28"/>
           <w:szCs w:val="28"/>
         </w:rPr>
-        <w:t xml:space="preserve">The Analytics module enables users to explore different traffic patterns through interactive visualizations. Users can </w:t>
-      </w:r>
-      <w:proofErr w:type="spellStart"/>
-      <w:r>
-        <w:rPr>
-          <w:rFonts w:ascii="Times New Roman" w:hAnsi="Times New Roman" w:cs="Times New Roman"/>
-          <w:iCs/>
-          <w:sz w:val="28"/>
-          <w:szCs w:val="28"/>
-        </w:rPr>
-        <w:t>analyze</w:t>
-      </w:r>
-      <w:proofErr w:type="spellEnd"/>
-      <w:r>
-        <w:rPr>
-          <w:rFonts w:ascii="Times New Roman" w:hAnsi="Times New Roman" w:cs="Times New Roman"/>
-          <w:iCs/>
-          <w:sz w:val="28"/>
-          <w:szCs w:val="28"/>
-        </w:rPr>
-        <w:t xml:space="preserve"> hourly traffic trends, weather impact, road type analysis, day-wise traffic patterns, and feature correlation</w:t>
+        <w:t>The Analytics module enables users to explore different traffic patterns through interactive visualizations. Users can analyze hourly traffic trends, weather impact, road type analysis, day-wise traffic patterns, and feature correlation</w:t>
       </w:r>
       <w:r>
         <w:rPr>
@@ -7708,27 +7371,7 @@
           <w:sz w:val="28"/>
           <w:szCs w:val="28"/>
         </w:rPr>
-        <w:t xml:space="preserve">The Prediction module allows users to enter traffic-related, weather-related, and road-related parameters. Based on the provided inputs, the optimized </w:t>
-      </w:r>
-      <w:proofErr w:type="spellStart"/>
-      <w:r>
-        <w:rPr>
-          <w:rFonts w:ascii="Times New Roman" w:hAnsi="Times New Roman" w:cs="Times New Roman"/>
-          <w:iCs/>
-          <w:sz w:val="28"/>
-          <w:szCs w:val="28"/>
-        </w:rPr>
-        <w:t>XGBoost</w:t>
-      </w:r>
-      <w:proofErr w:type="spellEnd"/>
-      <w:r>
-        <w:rPr>
-          <w:rFonts w:ascii="Times New Roman" w:hAnsi="Times New Roman" w:cs="Times New Roman"/>
-          <w:iCs/>
-          <w:sz w:val="28"/>
-          <w:szCs w:val="28"/>
-        </w:rPr>
-        <w:t xml:space="preserve"> model predicts the expected traffic volume and displays the estimated traffic condition.</w:t>
+        <w:t>The Prediction module allows users to enter traffic-related, weather-related, and road-related parameters. Based on the provided inputs, the optimized XGBoost model predicts the expected traffic volume and displays the estimated traffic condition.</w:t>
       </w:r>
     </w:p>
     <w:p>
@@ -8344,7 +7987,6 @@
                 <w:szCs w:val="28"/>
               </w:rPr>
             </w:pPr>
-            <w:proofErr w:type="spellStart"/>
             <w:r>
               <w:rPr>
                 <w:rFonts w:ascii="Times New Roman" w:hAnsi="Times New Roman" w:cs="Times New Roman"/>
@@ -8354,7 +7996,6 @@
               </w:rPr>
               <w:t>XGBoost</w:t>
             </w:r>
-            <w:proofErr w:type="spellEnd"/>
           </w:p>
         </w:tc>
         <w:tc>
@@ -8412,7 +8053,6 @@
                 <w:szCs w:val="28"/>
               </w:rPr>
             </w:pPr>
-            <w:proofErr w:type="spellStart"/>
             <w:r>
               <w:rPr>
                 <w:rFonts w:ascii="Times New Roman" w:hAnsi="Times New Roman" w:cs="Times New Roman"/>
@@ -8422,7 +8062,6 @@
               </w:rPr>
               <w:t>LightGBM</w:t>
             </w:r>
-            <w:proofErr w:type="spellEnd"/>
           </w:p>
         </w:tc>
         <w:tc>
@@ -8479,7 +8118,6 @@
                 <w:szCs w:val="28"/>
               </w:rPr>
             </w:pPr>
-            <w:proofErr w:type="spellStart"/>
             <w:r>
               <w:rPr>
                 <w:rFonts w:ascii="Times New Roman" w:hAnsi="Times New Roman" w:cs="Times New Roman"/>
@@ -8489,7 +8127,6 @@
               </w:rPr>
               <w:t>Streamlit</w:t>
             </w:r>
-            <w:proofErr w:type="spellEnd"/>
           </w:p>
         </w:tc>
         <w:tc>
@@ -8547,7 +8184,6 @@
                 <w:szCs w:val="28"/>
               </w:rPr>
             </w:pPr>
-            <w:proofErr w:type="spellStart"/>
             <w:r>
               <w:rPr>
                 <w:rFonts w:ascii="Times New Roman" w:hAnsi="Times New Roman" w:cs="Times New Roman"/>
@@ -8557,7 +8193,6 @@
               </w:rPr>
               <w:t>Plotly</w:t>
             </w:r>
-            <w:proofErr w:type="spellEnd"/>
           </w:p>
         </w:tc>
         <w:tc>
@@ -8617,7 +8252,6 @@
                 <w:szCs w:val="28"/>
               </w:rPr>
             </w:pPr>
-            <w:proofErr w:type="spellStart"/>
             <w:r>
               <w:rPr>
                 <w:rFonts w:ascii="Times New Roman" w:hAnsi="Times New Roman" w:cs="Times New Roman"/>
@@ -8627,7 +8261,6 @@
               </w:rPr>
               <w:t>Joblib</w:t>
             </w:r>
-            <w:proofErr w:type="spellEnd"/>
           </w:p>
         </w:tc>
         <w:tc>
@@ -8728,47 +8361,7 @@
           <w:sz w:val="28"/>
           <w:szCs w:val="28"/>
         </w:rPr>
-        <w:t xml:space="preserve">The Smart Traffic Demand Prediction System was successfully developed using machine learning techniques to predict traffic volume based on weather, temporal, and road-related features. After evaluating multiple regression models and applying hyperparameter tuning and ensemble learning, the optimized </w:t>
-      </w:r>
-      <w:proofErr w:type="spellStart"/>
-      <w:r>
-        <w:rPr>
-          <w:rFonts w:ascii="Times New Roman" w:hAnsi="Times New Roman" w:cs="Times New Roman"/>
-          <w:iCs/>
-          <w:sz w:val="28"/>
-          <w:szCs w:val="28"/>
-        </w:rPr>
-        <w:t>XGBoost</w:t>
-      </w:r>
-      <w:proofErr w:type="spellEnd"/>
-      <w:r>
-        <w:rPr>
-          <w:rFonts w:ascii="Times New Roman" w:hAnsi="Times New Roman" w:cs="Times New Roman"/>
-          <w:iCs/>
-          <w:sz w:val="28"/>
-          <w:szCs w:val="28"/>
-        </w:rPr>
-        <w:t xml:space="preserve"> Regressor was selected as the final model due to its superior predictive performance. The </w:t>
-      </w:r>
-      <w:proofErr w:type="spellStart"/>
-      <w:r>
-        <w:rPr>
-          <w:rFonts w:ascii="Times New Roman" w:hAnsi="Times New Roman" w:cs="Times New Roman"/>
-          <w:iCs/>
-          <w:sz w:val="28"/>
-          <w:szCs w:val="28"/>
-        </w:rPr>
-        <w:t>Streamlit</w:t>
-      </w:r>
-      <w:proofErr w:type="spellEnd"/>
-      <w:r>
-        <w:rPr>
-          <w:rFonts w:ascii="Times New Roman" w:hAnsi="Times New Roman" w:cs="Times New Roman"/>
-          <w:iCs/>
-          <w:sz w:val="28"/>
-          <w:szCs w:val="28"/>
-        </w:rPr>
-        <w:t>-based web application provides an interactive platform for traffic analysis and real-time traffic volume prediction, demonstrating the practical application of machine learning in intelligent transportation systems.</w:t>
+        <w:t>The Smart Traffic Demand Prediction System was successfully developed using machine learning techniques to predict traffic volume based on weather, temporal, and road-related features. After evaluating multiple regression models and applying hyperparameter tuning and ensemble learning, the optimized XGBoost Regressor was selected as the final model due to its superior predictive performance. The Streamlit-based web application provides an interactive platform for traffic analysis and real-time traffic volume prediction, demonstrating the practical application of machine learning in intelligent transportation systems.</w:t>
       </w:r>
     </w:p>
     <w:p>

</xml_diff>